<commit_message>
Finish part B of the report
</commit_message>
<xml_diff>
--- a/Assignments/Assignment2/Assignment2c/Assignment2c_Truong Ngoc Gia Hieu_105565520_Report.docx
+++ b/Assignments/Assignment2/Assignment2c/Assignment2c_Truong Ngoc Gia Hieu_105565520_Report.docx
@@ -116,9 +116,9 @@
           <w:lang w:val="en-US"/>
         </w:rPr>
       </w:pPr>
-      <w:bookmarkStart w:id="3" w:name="_Toc6709"/>
-      <w:bookmarkStart w:id="4" w:name="_Toc1139"/>
-      <w:bookmarkStart w:id="5" w:name="_Toc4586"/>
+      <w:bookmarkStart w:id="3" w:name="_Toc4586"/>
+      <w:bookmarkStart w:id="4" w:name="_Toc6709"/>
+      <w:bookmarkStart w:id="5" w:name="_Toc1139"/>
       <w:r>
         <w:rPr>
           <w:rFonts w:hint="default" w:ascii="Times New Roman" w:hAnsi="Times New Roman" w:cs="Times New Roman"/>
@@ -893,9 +893,9 @@
           <w:shd w:val="clear" w:color="auto" w:fill="auto"/>
         </w:rPr>
       </w:pPr>
-      <w:bookmarkStart w:id="6" w:name="_Toc3434"/>
-      <w:bookmarkStart w:id="7" w:name="_Toc166571946"/>
-      <w:bookmarkStart w:id="8" w:name="_Toc19771"/>
+      <w:bookmarkStart w:id="6" w:name="_Toc19771"/>
+      <w:bookmarkStart w:id="7" w:name="_Toc3434"/>
+      <w:bookmarkStart w:id="8" w:name="_Toc166571946"/>
       <w:r>
         <w:rPr>
           <w:rFonts w:hint="default" w:ascii="Times New Roman" w:hAnsi="Times New Roman" w:cs="Times New Roman"/>
@@ -1378,11 +1378,43 @@
     </w:p>
     <w:p>
       <w:pPr>
+        <w:pStyle w:val="20"/>
+        <w:tabs>
+          <w:tab w:val="right" w:leader="dot" w:pos="8302"/>
+        </w:tabs>
+        <w:spacing w:line="240" w:lineRule="auto"/>
         <w:rPr>
           <w:rFonts w:hint="default"/>
           <w:lang w:val="en-US"/>
         </w:rPr>
       </w:pPr>
+      <w:r>
+        <w:rPr>
+          <w:rFonts w:hint="default" w:ascii="Times New Roman" w:hAnsi="Times New Roman" w:cs="Times New Roman"/>
+          <w:b/>
+          <w:bCs/>
+          <w:color w:val="auto"/>
+          <w:sz w:val="32"/>
+          <w:szCs w:val="32"/>
+          <w:highlight w:val="none"/>
+          <w:shd w:val="clear" w:color="auto" w:fill="auto"/>
+          <w:lang w:val="en-US"/>
+        </w:rPr>
+        <w:t>Part C: Ethical Issues</w:t>
+      </w:r>
+      <w:r>
+        <w:rPr>
+          <w:rFonts w:hint="default" w:ascii="Times New Roman" w:hAnsi="Times New Roman" w:cs="Times New Roman"/>
+          <w:b/>
+          <w:bCs/>
+          <w:color w:val="auto"/>
+          <w:sz w:val="30"/>
+          <w:szCs w:val="30"/>
+          <w:highlight w:val="none"/>
+          <w:shd w:val="clear" w:color="auto" w:fill="auto"/>
+        </w:rPr>
+        <w:tab/>
+      </w:r>
     </w:p>
     <w:p>
       <w:pPr>
@@ -1404,6 +1436,129 @@
           <w:shd w:val="clear" w:color="auto" w:fill="auto"/>
         </w:rPr>
       </w:pPr>
+      <w:r>
+        <w:rPr>
+          <w:rFonts w:hint="default" w:ascii="Times New Roman" w:hAnsi="Times New Roman" w:cs="Times New Roman"/>
+          <w:b/>
+          <w:bCs/>
+          <w:color w:val="auto"/>
+          <w:sz w:val="28"/>
+          <w:szCs w:val="28"/>
+          <w:highlight w:val="none"/>
+          <w:shd w:val="clear" w:color="auto" w:fill="auto"/>
+          <w:lang w:val="en-US"/>
+        </w:rPr>
+        <w:t>3.1 Data Privacy and Security</w:t>
+      </w:r>
+      <w:r>
+        <w:rPr>
+          <w:rFonts w:hint="default" w:ascii="Times New Roman" w:hAnsi="Times New Roman" w:cs="Times New Roman"/>
+          <w:b/>
+          <w:bCs/>
+          <w:color w:val="auto"/>
+          <w:sz w:val="26"/>
+          <w:szCs w:val="26"/>
+          <w:highlight w:val="none"/>
+          <w:shd w:val="clear" w:color="auto" w:fill="auto"/>
+        </w:rPr>
+        <w:tab/>
+      </w:r>
+    </w:p>
+    <w:p>
+      <w:pPr>
+        <w:pStyle w:val="20"/>
+        <w:tabs>
+          <w:tab w:val="right" w:leader="dot" w:pos="8302"/>
+        </w:tabs>
+        <w:spacing w:line="240" w:lineRule="auto"/>
+        <w:ind w:left="220" w:leftChars="100" w:firstLine="0" w:firstLineChars="0"/>
+        <w:jc w:val="both"/>
+        <w:rPr>
+          <w:rFonts w:hint="default" w:ascii="Times New Roman" w:hAnsi="Times New Roman" w:cs="Times New Roman"/>
+          <w:b/>
+          <w:bCs/>
+          <w:color w:val="auto"/>
+          <w:sz w:val="26"/>
+          <w:szCs w:val="26"/>
+          <w:highlight w:val="none"/>
+          <w:shd w:val="clear" w:color="auto" w:fill="auto"/>
+        </w:rPr>
+      </w:pPr>
+      <w:r>
+        <w:rPr>
+          <w:rFonts w:hint="default" w:ascii="Times New Roman" w:hAnsi="Times New Roman" w:cs="Times New Roman"/>
+          <w:b/>
+          <w:bCs/>
+          <w:color w:val="auto"/>
+          <w:sz w:val="28"/>
+          <w:szCs w:val="28"/>
+          <w:highlight w:val="none"/>
+          <w:shd w:val="clear" w:color="auto" w:fill="auto"/>
+          <w:lang w:val="en-US"/>
+        </w:rPr>
+        <w:t>3.2 Algorithmic Bias and Fairness</w:t>
+      </w:r>
+      <w:r>
+        <w:rPr>
+          <w:rFonts w:hint="default" w:ascii="Times New Roman" w:hAnsi="Times New Roman" w:cs="Times New Roman"/>
+          <w:b/>
+          <w:bCs/>
+          <w:color w:val="auto"/>
+          <w:sz w:val="26"/>
+          <w:szCs w:val="26"/>
+          <w:highlight w:val="none"/>
+          <w:shd w:val="clear" w:color="auto" w:fill="auto"/>
+        </w:rPr>
+        <w:tab/>
+      </w:r>
+    </w:p>
+    <w:p>
+      <w:pPr>
+        <w:pStyle w:val="20"/>
+        <w:tabs>
+          <w:tab w:val="right" w:leader="dot" w:pos="8302"/>
+        </w:tabs>
+        <w:spacing w:line="240" w:lineRule="auto"/>
+        <w:ind w:left="220" w:leftChars="100" w:firstLine="0" w:firstLineChars="0"/>
+        <w:jc w:val="both"/>
+        <w:rPr>
+          <w:rFonts w:hint="default" w:ascii="Times New Roman" w:hAnsi="Times New Roman" w:cs="Times New Roman"/>
+          <w:b/>
+          <w:bCs/>
+          <w:color w:val="auto"/>
+          <w:sz w:val="26"/>
+          <w:szCs w:val="26"/>
+          <w:highlight w:val="none"/>
+          <w:shd w:val="clear" w:color="auto" w:fill="auto"/>
+        </w:rPr>
+      </w:pPr>
+      <w:r>
+        <w:rPr>
+          <w:rFonts w:hint="default" w:ascii="Times New Roman" w:hAnsi="Times New Roman" w:cs="Times New Roman"/>
+          <w:b/>
+          <w:bCs/>
+          <w:color w:val="auto"/>
+          <w:sz w:val="28"/>
+          <w:szCs w:val="28"/>
+          <w:highlight w:val="none"/>
+          <w:shd w:val="clear" w:color="auto" w:fill="auto"/>
+          <w:lang w:val="en-US"/>
+        </w:rPr>
+        <w:t>3.3 Accountability and Transparency</w:t>
+      </w:r>
+      <w:r>
+        <w:rPr>
+          <w:rFonts w:hint="default" w:ascii="Times New Roman" w:hAnsi="Times New Roman" w:cs="Times New Roman"/>
+          <w:b/>
+          <w:bCs/>
+          <w:color w:val="auto"/>
+          <w:sz w:val="26"/>
+          <w:szCs w:val="26"/>
+          <w:highlight w:val="none"/>
+          <w:shd w:val="clear" w:color="auto" w:fill="auto"/>
+        </w:rPr>
+        <w:tab/>
+      </w:r>
     </w:p>
     <w:p>
       <w:pPr>
@@ -1597,7 +1752,6 @@
     <w:p>
       <w:pPr>
         <w:spacing w:line="240" w:lineRule="auto"/>
-        <w:ind w:left="220" w:leftChars="100" w:firstLine="0" w:firstLineChars="0"/>
         <w:jc w:val="both"/>
         <w:rPr>
           <w:rFonts w:hint="default" w:ascii="Times New Roman" w:hAnsi="Times New Roman" w:cs="Times New Roman"/>
@@ -1632,23 +1786,6 @@
           <w:sz w:val="24"/>
           <w:szCs w:val="24"/>
           <w:highlight w:val="none"/>
-        </w:rPr>
-      </w:pPr>
-    </w:p>
-    <w:p>
-      <w:pPr>
-        <w:spacing w:line="240" w:lineRule="auto"/>
-        <w:jc w:val="both"/>
-        <w:rPr>
-          <w:rFonts w:hint="default" w:ascii="Times New Roman" w:hAnsi="Times New Roman" w:cs="Times New Roman"/>
-          <w:b/>
-          <w:bCs/>
-          <w:color w:val="auto"/>
-          <w:sz w:val="28"/>
-          <w:szCs w:val="28"/>
-          <w:highlight w:val="none"/>
-          <w:shd w:val="clear" w:color="auto" w:fill="auto"/>
-          <w:lang w:val="en-US"/>
         </w:rPr>
       </w:pPr>
     </w:p>
@@ -2508,7 +2645,7 @@
         </w:numPr>
         <w:bidi w:val="0"/>
         <w:ind w:leftChars="0"/>
-        <w:jc w:val="center"/>
+        <w:jc w:val="both"/>
         <w:rPr>
           <w:rFonts w:hint="default" w:ascii="Times New Roman" w:hAnsi="Times New Roman" w:eastAsia="SimSun" w:cs="Times New Roman"/>
           <w:b w:val="0"/>
@@ -2580,90 +2717,6 @@
         </w:rPr>
         <w:t>2.2 Route Planner Page</w:t>
       </w:r>
-      <w:r>
-        <w:rPr>
-          <w:rFonts w:hint="default" w:ascii="Times New Roman" w:hAnsi="Times New Roman" w:eastAsia="SimSun" w:cs="Times New Roman"/>
-          <w:b w:val="0"/>
-          <w:bCs w:val="0"/>
-          <w:sz w:val="25"/>
-          <w:szCs w:val="25"/>
-          <w:lang w:val="en-US"/>
-        </w:rPr>
-        <w:br w:type="textWrapping"/>
-      </w:r>
-      <w:r>
-        <w:rPr>
-          <w:rFonts w:hint="default" w:ascii="Times New Roman" w:hAnsi="Times New Roman" w:eastAsia="SimSun" w:cs="Times New Roman"/>
-          <w:b w:val="0"/>
-          <w:bCs w:val="0"/>
-          <w:sz w:val="25"/>
-          <w:szCs w:val="25"/>
-          <w:lang w:val="en-US"/>
-        </w:rPr>
-        <w:br w:type="textWrapping"/>
-      </w:r>
-      <w:r>
-        <w:rPr>
-          <w:rFonts w:hint="default" w:ascii="Times New Roman" w:hAnsi="Times New Roman" w:eastAsia="SimSun" w:cs="Times New Roman"/>
-          <w:b/>
-          <w:bCs/>
-          <w:i/>
-          <w:iCs w:val="0"/>
-          <w:sz w:val="21"/>
-          <w:szCs w:val="21"/>
-          <w:lang w:val="en-US"/>
-        </w:rPr>
-        <w:t xml:space="preserve">Figure 2: </w:t>
-      </w:r>
-      <w:r>
-        <w:rPr>
-          <w:rFonts w:hint="default" w:ascii="Times New Roman" w:hAnsi="Times New Roman" w:eastAsia="SimSun" w:cs="Times New Roman"/>
-          <w:b/>
-          <w:bCs/>
-          <w:i/>
-          <w:iCs w:val="0"/>
-          <w:sz w:val="21"/>
-          <w:szCs w:val="21"/>
-        </w:rPr>
-        <w:t>Conceptual Design of the Intelligent Route Planner Interface featuring Interactive SCATS Network Mapping.</w:t>
-      </w:r>
-      <w:bookmarkStart w:id="9" w:name="_GoBack"/>
-      <w:bookmarkEnd w:id="9"/>
-      <w:r>
-        <w:rPr>
-          <w:rFonts w:hint="default" w:ascii="Times New Roman" w:hAnsi="Times New Roman" w:eastAsia="SimSun" w:cs="Times New Roman"/>
-          <w:b w:val="0"/>
-          <w:bCs w:val="0"/>
-          <w:i w:val="0"/>
-          <w:iCs/>
-          <w:sz w:val="25"/>
-          <w:szCs w:val="25"/>
-          <w:lang w:val="en-US"/>
-        </w:rPr>
-        <w:br w:type="textWrapping"/>
-      </w:r>
-      <w:r>
-        <w:rPr>
-          <w:rFonts w:hint="default" w:ascii="Times New Roman" w:hAnsi="Times New Roman" w:eastAsia="SimSun" w:cs="Times New Roman"/>
-          <w:b w:val="0"/>
-          <w:bCs w:val="0"/>
-          <w:sz w:val="25"/>
-          <w:szCs w:val="25"/>
-          <w:lang w:val="en-US"/>
-        </w:rPr>
-        <w:br w:type="textWrapping"/>
-      </w:r>
-      <w:r>
-        <w:rPr>
-          <w:rFonts w:hint="default" w:ascii="Times New Roman" w:hAnsi="Times New Roman" w:eastAsia="SimSun" w:cs="Times New Roman"/>
-          <w:b w:val="0"/>
-          <w:bCs w:val="0"/>
-          <w:sz w:val="25"/>
-          <w:szCs w:val="25"/>
-          <w:lang w:val="en-US"/>
-        </w:rPr>
-        <w:br w:type="textWrapping"/>
-      </w:r>
     </w:p>
     <w:p>
       <w:pPr>
@@ -2675,6 +2728,1537 @@
         <w:jc w:val="both"/>
         <w:rPr>
           <w:rFonts w:hint="default" w:ascii="Times New Roman" w:hAnsi="Times New Roman" w:eastAsia="SimSun" w:cs="Times New Roman"/>
+          <w:sz w:val="25"/>
+          <w:szCs w:val="25"/>
+          <w:lang w:val="en-US"/>
+        </w:rPr>
+      </w:pPr>
+    </w:p>
+    <w:p>
+      <w:pPr>
+        <w:numPr>
+          <w:ilvl w:val="0"/>
+          <w:numId w:val="0"/>
+        </w:numPr>
+        <w:ind w:leftChars="0"/>
+        <w:jc w:val="center"/>
+        <w:rPr>
+          <w:rFonts w:hint="default" w:ascii="Times New Roman" w:hAnsi="Times New Roman" w:eastAsia="SimSun"/>
+          <w:b/>
+          <w:bCs/>
+          <w:i/>
+          <w:iCs/>
+          <w:sz w:val="21"/>
+          <w:szCs w:val="21"/>
+          <w:lang w:val="en-US"/>
+        </w:rPr>
+      </w:pPr>
+      <w:r>
+        <w:rPr>
+          <w:rFonts w:hint="default" w:ascii="Times New Roman" w:hAnsi="Times New Roman" w:eastAsia="SimSun"/>
+          <w:b/>
+          <w:bCs/>
+          <w:i/>
+          <w:iCs/>
+          <w:sz w:val="21"/>
+          <w:szCs w:val="21"/>
+          <w:lang w:val="en-US"/>
+        </w:rPr>
+        <w:t>Figure 2: Conceptual Design of the Intelligent Route Planner Interface featuring Interactive SCATS Network Mapping</w:t>
+      </w:r>
+    </w:p>
+    <w:p>
+      <w:pPr>
+        <w:numPr>
+          <w:ilvl w:val="0"/>
+          <w:numId w:val="0"/>
+        </w:numPr>
+        <w:ind w:leftChars="0"/>
+        <w:jc w:val="both"/>
+        <w:rPr>
+          <w:rFonts w:hint="default" w:ascii="Times New Roman" w:hAnsi="Times New Roman" w:eastAsia="SimSun"/>
+          <w:b w:val="0"/>
+          <w:bCs w:val="0"/>
+          <w:i w:val="0"/>
+          <w:iCs w:val="0"/>
+          <w:sz w:val="25"/>
+          <w:szCs w:val="25"/>
+          <w:lang w:val="en-US"/>
+        </w:rPr>
+      </w:pPr>
+      <w:r>
+        <w:rPr>
+          <w:rFonts w:hint="default" w:ascii="Times New Roman" w:hAnsi="Times New Roman" w:eastAsia="SimSun"/>
+          <w:b w:val="0"/>
+          <w:bCs w:val="0"/>
+          <w:i w:val="0"/>
+          <w:iCs w:val="0"/>
+          <w:sz w:val="25"/>
+          <w:szCs w:val="25"/>
+          <w:lang w:val="en-US"/>
+        </w:rPr>
+        <w:t xml:space="preserve">As indicated in </w:t>
+      </w:r>
+      <w:r>
+        <w:rPr>
+          <w:rFonts w:hint="default" w:ascii="Times New Roman" w:hAnsi="Times New Roman" w:eastAsia="SimSun"/>
+          <w:b/>
+          <w:bCs/>
+          <w:i/>
+          <w:iCs/>
+          <w:sz w:val="25"/>
+          <w:szCs w:val="25"/>
+          <w:lang w:val="en-US"/>
+        </w:rPr>
+        <w:t>Figure 2</w:t>
+      </w:r>
+      <w:r>
+        <w:rPr>
+          <w:rFonts w:hint="default" w:ascii="Times New Roman" w:hAnsi="Times New Roman" w:eastAsia="SimSun"/>
+          <w:b w:val="0"/>
+          <w:bCs w:val="0"/>
+          <w:i w:val="0"/>
+          <w:iCs w:val="0"/>
+          <w:sz w:val="25"/>
+          <w:szCs w:val="25"/>
+          <w:lang w:val="en-US"/>
+        </w:rPr>
+        <w:t>, the Route Planner page highlights the primary user interface of the Intelligent Route Planner which is designed to facilitate efficient navigation within the Boroondara traffic network. Furthermore, the interface features a high-fidelity interactive map that serves as the visual foundation for pathfinding tasks. Besides that, this geospatial component allows users to monitor the entire SCATS station distribution in real-time. By integrating a clean layout, the system ensures that complex AI-driven routing data is presented in a way that is accessible for both traffic operators and general commuters, emphasizing the practical application of graph theory in urban management.</w:t>
+      </w:r>
+    </w:p>
+    <w:p>
+      <w:pPr>
+        <w:pStyle w:val="3"/>
+        <w:numPr>
+          <w:ilvl w:val="0"/>
+          <w:numId w:val="0"/>
+        </w:numPr>
+        <w:bidi w:val="0"/>
+        <w:ind w:leftChars="0"/>
+        <w:jc w:val="both"/>
+        <w:rPr>
+          <w:rFonts w:hint="default"/>
+          <w:lang w:val="en-US"/>
+        </w:rPr>
+      </w:pPr>
+      <w:r>
+        <w:rPr>
+          <w:rFonts w:hint="default"/>
+          <w:lang w:val="en-US"/>
+        </w:rPr>
+        <w:t>2.3 Model Training Page</w:t>
+      </w:r>
+    </w:p>
+    <w:p>
+      <w:pPr>
+        <w:rPr>
+          <w:rFonts w:hint="default"/>
+          <w:lang w:val="en-US"/>
+        </w:rPr>
+      </w:pPr>
+      <w:r>
+        <w:rPr>
+          <w:rFonts w:hint="default"/>
+          <w:lang w:val="en-US"/>
+        </w:rPr>
+        <w:drawing>
+          <wp:anchor distT="0" distB="0" distL="114300" distR="114300" simplePos="0" relativeHeight="251661312" behindDoc="0" locked="0" layoutInCell="1" allowOverlap="1">
+            <wp:simplePos x="0" y="0"/>
+            <wp:positionH relativeFrom="column">
+              <wp:posOffset>432435</wp:posOffset>
+            </wp:positionH>
+            <wp:positionV relativeFrom="paragraph">
+              <wp:posOffset>20320</wp:posOffset>
+            </wp:positionV>
+            <wp:extent cx="4413885" cy="2508250"/>
+            <wp:effectExtent l="0" t="0" r="5715" b="6350"/>
+            <wp:wrapSquare wrapText="bothSides"/>
+            <wp:docPr id="5" name="Picture 5" descr="Model Training page"/>
+            <wp:cNvGraphicFramePr>
+              <a:graphicFrameLocks xmlns:a="http://schemas.openxmlformats.org/drawingml/2006/main" noChangeAspect="1"/>
+            </wp:cNvGraphicFramePr>
+            <a:graphic xmlns:a="http://schemas.openxmlformats.org/drawingml/2006/main">
+              <a:graphicData uri="http://schemas.openxmlformats.org/drawingml/2006/picture">
+                <pic:pic xmlns:pic="http://schemas.openxmlformats.org/drawingml/2006/picture">
+                  <pic:nvPicPr>
+                    <pic:cNvPr id="5" name="Picture 5" descr="Model Training page"/>
+                    <pic:cNvPicPr>
+                      <a:picLocks noChangeAspect="1"/>
+                    </pic:cNvPicPr>
+                  </pic:nvPicPr>
+                  <pic:blipFill>
+                    <a:blip r:embed="rId10"/>
+                    <a:stretch>
+                      <a:fillRect/>
+                    </a:stretch>
+                  </pic:blipFill>
+                  <pic:spPr>
+                    <a:xfrm>
+                      <a:off x="0" y="0"/>
+                      <a:ext cx="4413885" cy="2508250"/>
+                    </a:xfrm>
+                    <a:prstGeom prst="rect">
+                      <a:avLst/>
+                    </a:prstGeom>
+                  </pic:spPr>
+                </pic:pic>
+              </a:graphicData>
+            </a:graphic>
+          </wp:anchor>
+        </w:drawing>
+      </w:r>
+    </w:p>
+    <w:p>
+      <w:pPr>
+        <w:numPr>
+          <w:ilvl w:val="0"/>
+          <w:numId w:val="0"/>
+        </w:numPr>
+        <w:ind w:leftChars="0"/>
+        <w:jc w:val="center"/>
+        <w:rPr>
+          <w:rFonts w:hint="default" w:ascii="Times New Roman" w:hAnsi="Times New Roman" w:eastAsia="SimSun" w:cs="Times New Roman"/>
+          <w:b/>
+          <w:bCs/>
+          <w:i/>
+          <w:iCs/>
+          <w:sz w:val="21"/>
+          <w:szCs w:val="21"/>
+        </w:rPr>
+      </w:pPr>
+      <w:r>
+        <w:rPr>
+          <w:rFonts w:hint="default" w:ascii="Times New Roman" w:hAnsi="Times New Roman" w:eastAsia="SimSun"/>
+          <w:b w:val="0"/>
+          <w:bCs w:val="0"/>
+          <w:i w:val="0"/>
+          <w:iCs w:val="0"/>
+          <w:sz w:val="25"/>
+          <w:szCs w:val="25"/>
+          <w:lang w:val="en-US"/>
+        </w:rPr>
+        <w:br w:type="textWrapping"/>
+      </w:r>
+      <w:r>
+        <w:rPr>
+          <w:rFonts w:hint="default" w:ascii="Times New Roman" w:hAnsi="Times New Roman" w:eastAsia="SimSun"/>
+          <w:b w:val="0"/>
+          <w:bCs w:val="0"/>
+          <w:i w:val="0"/>
+          <w:iCs w:val="0"/>
+          <w:sz w:val="25"/>
+          <w:szCs w:val="25"/>
+          <w:lang w:val="en-US"/>
+        </w:rPr>
+        <w:br w:type="textWrapping"/>
+      </w:r>
+      <w:r>
+        <w:rPr>
+          <w:rFonts w:hint="default" w:ascii="Times New Roman" w:hAnsi="Times New Roman" w:eastAsia="SimSun"/>
+          <w:b w:val="0"/>
+          <w:bCs w:val="0"/>
+          <w:i w:val="0"/>
+          <w:iCs w:val="0"/>
+          <w:sz w:val="25"/>
+          <w:szCs w:val="25"/>
+          <w:lang w:val="en-US"/>
+        </w:rPr>
+        <w:br w:type="textWrapping"/>
+      </w:r>
+      <w:r>
+        <w:rPr>
+          <w:rFonts w:hint="default" w:ascii="Times New Roman" w:hAnsi="Times New Roman" w:eastAsia="SimSun"/>
+          <w:b w:val="0"/>
+          <w:bCs w:val="0"/>
+          <w:i w:val="0"/>
+          <w:iCs w:val="0"/>
+          <w:sz w:val="25"/>
+          <w:szCs w:val="25"/>
+          <w:lang w:val="en-US"/>
+        </w:rPr>
+        <w:br w:type="textWrapping"/>
+      </w:r>
+      <w:r>
+        <w:rPr>
+          <w:rFonts w:hint="default" w:ascii="Times New Roman" w:hAnsi="Times New Roman" w:eastAsia="SimSun"/>
+          <w:b w:val="0"/>
+          <w:bCs w:val="0"/>
+          <w:i w:val="0"/>
+          <w:iCs w:val="0"/>
+          <w:sz w:val="25"/>
+          <w:szCs w:val="25"/>
+          <w:lang w:val="en-US"/>
+        </w:rPr>
+        <w:br w:type="textWrapping"/>
+      </w:r>
+      <w:r>
+        <w:rPr>
+          <w:rFonts w:hint="default" w:ascii="Times New Roman" w:hAnsi="Times New Roman" w:eastAsia="SimSun"/>
+          <w:b w:val="0"/>
+          <w:bCs w:val="0"/>
+          <w:i w:val="0"/>
+          <w:iCs w:val="0"/>
+          <w:sz w:val="25"/>
+          <w:szCs w:val="25"/>
+          <w:lang w:val="en-US"/>
+        </w:rPr>
+        <w:br w:type="textWrapping"/>
+      </w:r>
+      <w:r>
+        <w:rPr>
+          <w:rFonts w:hint="default" w:ascii="Times New Roman" w:hAnsi="Times New Roman" w:eastAsia="SimSun"/>
+          <w:b w:val="0"/>
+          <w:bCs w:val="0"/>
+          <w:i w:val="0"/>
+          <w:iCs w:val="0"/>
+          <w:sz w:val="25"/>
+          <w:szCs w:val="25"/>
+          <w:lang w:val="en-US"/>
+        </w:rPr>
+        <w:br w:type="textWrapping"/>
+      </w:r>
+      <w:r>
+        <w:rPr>
+          <w:rFonts w:hint="default" w:ascii="Times New Roman" w:hAnsi="Times New Roman" w:eastAsia="SimSun"/>
+          <w:b w:val="0"/>
+          <w:bCs w:val="0"/>
+          <w:i w:val="0"/>
+          <w:iCs w:val="0"/>
+          <w:sz w:val="25"/>
+          <w:szCs w:val="25"/>
+          <w:lang w:val="en-US"/>
+        </w:rPr>
+        <w:br w:type="textWrapping"/>
+      </w:r>
+      <w:r>
+        <w:rPr>
+          <w:rFonts w:hint="default" w:ascii="Times New Roman" w:hAnsi="Times New Roman" w:eastAsia="SimSun"/>
+          <w:b w:val="0"/>
+          <w:bCs w:val="0"/>
+          <w:i w:val="0"/>
+          <w:iCs w:val="0"/>
+          <w:sz w:val="25"/>
+          <w:szCs w:val="25"/>
+          <w:lang w:val="en-US"/>
+        </w:rPr>
+        <w:br w:type="textWrapping"/>
+      </w:r>
+      <w:r>
+        <w:rPr>
+          <w:rFonts w:hint="default" w:ascii="Times New Roman" w:hAnsi="Times New Roman" w:eastAsia="SimSun"/>
+          <w:b w:val="0"/>
+          <w:bCs w:val="0"/>
+          <w:i w:val="0"/>
+          <w:iCs w:val="0"/>
+          <w:sz w:val="25"/>
+          <w:szCs w:val="25"/>
+          <w:lang w:val="en-US"/>
+        </w:rPr>
+        <w:br w:type="textWrapping"/>
+      </w:r>
+      <w:r>
+        <w:rPr>
+          <w:rFonts w:hint="default" w:ascii="Times New Roman" w:hAnsi="Times New Roman" w:eastAsia="SimSun"/>
+          <w:b w:val="0"/>
+          <w:bCs w:val="0"/>
+          <w:i w:val="0"/>
+          <w:iCs w:val="0"/>
+          <w:sz w:val="25"/>
+          <w:szCs w:val="25"/>
+          <w:lang w:val="en-US"/>
+        </w:rPr>
+        <w:br w:type="textWrapping"/>
+      </w:r>
+      <w:r>
+        <w:rPr>
+          <w:rFonts w:hint="default" w:ascii="Times New Roman" w:hAnsi="Times New Roman" w:eastAsia="SimSun"/>
+          <w:b w:val="0"/>
+          <w:bCs w:val="0"/>
+          <w:i w:val="0"/>
+          <w:iCs w:val="0"/>
+          <w:sz w:val="25"/>
+          <w:szCs w:val="25"/>
+          <w:lang w:val="en-US"/>
+        </w:rPr>
+        <w:br w:type="textWrapping"/>
+      </w:r>
+      <w:r>
+        <w:rPr>
+          <w:rFonts w:hint="default" w:ascii="Times New Roman" w:hAnsi="Times New Roman" w:eastAsia="SimSun" w:cs="Times New Roman"/>
+          <w:b/>
+          <w:bCs/>
+          <w:i/>
+          <w:iCs/>
+          <w:sz w:val="21"/>
+          <w:szCs w:val="21"/>
+          <w:lang w:val="en-US"/>
+        </w:rPr>
+        <w:t xml:space="preserve">Figure 3: </w:t>
+      </w:r>
+      <w:r>
+        <w:rPr>
+          <w:rFonts w:hint="default" w:ascii="Times New Roman" w:hAnsi="Times New Roman" w:eastAsia="SimSun" w:cs="Times New Roman"/>
+          <w:b/>
+          <w:bCs/>
+          <w:i/>
+          <w:iCs/>
+          <w:sz w:val="21"/>
+          <w:szCs w:val="21"/>
+        </w:rPr>
+        <w:t>Model Training Dashboard and Performance Metrics Comparison</w:t>
+      </w:r>
+    </w:p>
+    <w:p>
+      <w:pPr>
+        <w:keepNext w:val="0"/>
+        <w:keepLines w:val="0"/>
+        <w:widowControl/>
+        <w:suppressLineNumbers w:val="0"/>
+        <w:jc w:val="both"/>
+        <w:rPr>
+          <w:rFonts w:hint="default" w:ascii="Times New Roman" w:hAnsi="Times New Roman" w:cs="Times New Roman"/>
+          <w:b w:val="0"/>
+          <w:bCs w:val="0"/>
+          <w:sz w:val="25"/>
+          <w:szCs w:val="25"/>
+        </w:rPr>
+      </w:pPr>
+      <w:r>
+        <w:rPr>
+          <w:rFonts w:hint="default" w:ascii="Times New Roman" w:hAnsi="Times New Roman" w:eastAsia="SimSun" w:cs="Times New Roman"/>
+          <w:b w:val="0"/>
+          <w:bCs w:val="0"/>
+          <w:i w:val="0"/>
+          <w:iCs w:val="0"/>
+          <w:sz w:val="25"/>
+          <w:szCs w:val="25"/>
+          <w:lang w:val="en-US"/>
+        </w:rPr>
+        <w:t xml:space="preserve">Next, </w:t>
+      </w:r>
+      <w:r>
+        <w:rPr>
+          <w:rFonts w:hint="default" w:ascii="Times New Roman" w:hAnsi="Times New Roman" w:eastAsia="SimSun" w:cs="Times New Roman"/>
+          <w:b w:val="0"/>
+          <w:bCs w:val="0"/>
+          <w:i/>
+          <w:iCs/>
+          <w:sz w:val="25"/>
+          <w:szCs w:val="25"/>
+          <w:lang w:val="en-US"/>
+        </w:rPr>
+        <w:t>Figure 3</w:t>
+      </w:r>
+      <w:r>
+        <w:rPr>
+          <w:rFonts w:hint="default" w:ascii="Times New Roman" w:hAnsi="Times New Roman" w:eastAsia="SimSun" w:cs="Times New Roman"/>
+          <w:b w:val="0"/>
+          <w:bCs w:val="0"/>
+          <w:i w:val="0"/>
+          <w:iCs w:val="0"/>
+          <w:sz w:val="25"/>
+          <w:szCs w:val="25"/>
+          <w:lang w:val="en-US"/>
+        </w:rPr>
+        <w:t xml:space="preserve"> indicates</w:t>
+      </w:r>
+      <w:r>
+        <w:rPr>
+          <w:rFonts w:hint="default" w:ascii="Times New Roman" w:hAnsi="Times New Roman" w:eastAsia="SimSun" w:cs="Times New Roman"/>
+          <w:b w:val="0"/>
+          <w:bCs w:val="0"/>
+          <w:i/>
+          <w:iCs/>
+          <w:sz w:val="25"/>
+          <w:szCs w:val="25"/>
+          <w:lang w:val="en-US"/>
+        </w:rPr>
+        <w:t xml:space="preserve"> </w:t>
+      </w:r>
+      <w:r>
+        <w:rPr>
+          <w:rFonts w:hint="default" w:ascii="Times New Roman" w:hAnsi="Times New Roman" w:eastAsia="SimSun" w:cs="Times New Roman"/>
+          <w:b w:val="0"/>
+          <w:bCs w:val="0"/>
+          <w:kern w:val="0"/>
+          <w:sz w:val="25"/>
+          <w:szCs w:val="25"/>
+          <w:lang w:val="en-US" w:eastAsia="zh-CN" w:bidi="ar"/>
+        </w:rPr>
+        <w:t xml:space="preserve">the </w:t>
+      </w:r>
+      <w:r>
+        <w:rPr>
+          <w:rFonts w:hint="default" w:ascii="Times New Roman" w:hAnsi="Times New Roman" w:eastAsia="sans-serif" w:cs="Times New Roman"/>
+          <w:b w:val="0"/>
+          <w:bCs w:val="0"/>
+          <w:kern w:val="0"/>
+          <w:sz w:val="25"/>
+          <w:szCs w:val="25"/>
+          <w:lang w:val="en-US" w:eastAsia="zh-CN" w:bidi="ar"/>
+        </w:rPr>
+        <w:t>Model Training</w:t>
+      </w:r>
+      <w:r>
+        <w:rPr>
+          <w:rFonts w:hint="default" w:ascii="Times New Roman" w:hAnsi="Times New Roman" w:eastAsia="SimSun" w:cs="Times New Roman"/>
+          <w:b w:val="0"/>
+          <w:bCs w:val="0"/>
+          <w:kern w:val="0"/>
+          <w:sz w:val="25"/>
+          <w:szCs w:val="25"/>
+          <w:lang w:val="en-US" w:eastAsia="zh-CN" w:bidi="ar"/>
+        </w:rPr>
+        <w:t xml:space="preserve"> page and its integrated machine learning workflow. Therefore, this user-friendly subpage manages the entire </w:t>
+      </w:r>
+      <w:r>
+        <w:rPr>
+          <w:rFonts w:hint="default" w:ascii="Times New Roman" w:hAnsi="Times New Roman" w:eastAsia="sans-serif" w:cs="Times New Roman"/>
+          <w:b w:val="0"/>
+          <w:bCs w:val="0"/>
+          <w:kern w:val="0"/>
+          <w:sz w:val="25"/>
+          <w:szCs w:val="25"/>
+          <w:lang w:val="en-US" w:eastAsia="zh-CN" w:bidi="ar"/>
+        </w:rPr>
+        <w:t>Training Pipeline</w:t>
+      </w:r>
+      <w:r>
+        <w:rPr>
+          <w:rFonts w:hint="default" w:ascii="Times New Roman" w:hAnsi="Times New Roman" w:eastAsia="SimSun" w:cs="Times New Roman"/>
+          <w:b w:val="0"/>
+          <w:bCs w:val="0"/>
+          <w:kern w:val="0"/>
+          <w:sz w:val="25"/>
+          <w:szCs w:val="25"/>
+          <w:lang w:val="en-US" w:eastAsia="zh-CN" w:bidi="ar"/>
+        </w:rPr>
+        <w:t xml:space="preserve">, allowing for a systematic comparison of </w:t>
+      </w:r>
+      <w:r>
+        <w:rPr>
+          <w:rFonts w:hint="default" w:ascii="Times New Roman" w:hAnsi="Times New Roman" w:eastAsia="sans-serif" w:cs="Times New Roman"/>
+          <w:b w:val="0"/>
+          <w:bCs w:val="0"/>
+          <w:kern w:val="0"/>
+          <w:sz w:val="25"/>
+          <w:szCs w:val="25"/>
+          <w:lang w:val="en-US" w:eastAsia="zh-CN" w:bidi="ar"/>
+        </w:rPr>
+        <w:t>LSTM, GRU, and BLSTM</w:t>
+      </w:r>
+      <w:r>
+        <w:rPr>
+          <w:rFonts w:hint="default" w:ascii="Times New Roman" w:hAnsi="Times New Roman" w:eastAsia="SimSun" w:cs="Times New Roman"/>
+          <w:b w:val="0"/>
+          <w:bCs w:val="0"/>
+          <w:kern w:val="0"/>
+          <w:sz w:val="25"/>
+          <w:szCs w:val="25"/>
+          <w:lang w:val="en-US" w:eastAsia="zh-CN" w:bidi="ar"/>
+        </w:rPr>
+        <w:t xml:space="preserve"> models through key performance indicators such as R</w:t>
+      </w:r>
+      <w:r>
+        <w:rPr>
+          <w:rFonts w:hint="default" w:ascii="Times New Roman" w:hAnsi="Times New Roman" w:eastAsia="SimSun" w:cs="Times New Roman"/>
+          <w:b w:val="0"/>
+          <w:bCs w:val="0"/>
+          <w:kern w:val="0"/>
+          <w:sz w:val="25"/>
+          <w:szCs w:val="25"/>
+          <w:vertAlign w:val="superscript"/>
+          <w:lang w:val="en-US" w:eastAsia="zh-CN" w:bidi="ar"/>
+        </w:rPr>
+        <w:t>2</w:t>
+      </w:r>
+      <w:r>
+        <w:rPr>
+          <w:rFonts w:hint="default" w:ascii="Times New Roman" w:hAnsi="Times New Roman" w:eastAsia="sans-serif" w:cs="Times New Roman"/>
+          <w:b w:val="0"/>
+          <w:bCs w:val="0"/>
+          <w:kern w:val="0"/>
+          <w:sz w:val="25"/>
+          <w:szCs w:val="25"/>
+          <w:lang w:val="en-US" w:eastAsia="zh-CN" w:bidi="ar"/>
+        </w:rPr>
+        <w:t>, MAE, and RMSE</w:t>
+      </w:r>
+      <w:r>
+        <w:rPr>
+          <w:rFonts w:hint="default" w:ascii="Times New Roman" w:hAnsi="Times New Roman" w:eastAsia="SimSun" w:cs="Times New Roman"/>
+          <w:b w:val="0"/>
+          <w:bCs w:val="0"/>
+          <w:kern w:val="0"/>
+          <w:sz w:val="25"/>
+          <w:szCs w:val="25"/>
+          <w:lang w:val="en-US" w:eastAsia="zh-CN" w:bidi="ar"/>
+        </w:rPr>
+        <w:t xml:space="preserve">. </w:t>
+      </w:r>
+      <w:r>
+        <w:rPr>
+          <w:rFonts w:hint="default" w:ascii="Times New Roman" w:hAnsi="Times New Roman" w:eastAsia="sans-serif" w:cs="Times New Roman"/>
+          <w:b w:val="0"/>
+          <w:bCs w:val="0"/>
+          <w:kern w:val="0"/>
+          <w:sz w:val="25"/>
+          <w:szCs w:val="25"/>
+          <w:lang w:val="en-US" w:eastAsia="zh-CN" w:bidi="ar"/>
+        </w:rPr>
+        <w:t>Furthermore</w:t>
+      </w:r>
+      <w:r>
+        <w:rPr>
+          <w:rFonts w:hint="default" w:ascii="Times New Roman" w:hAnsi="Times New Roman" w:eastAsia="SimSun" w:cs="Times New Roman"/>
+          <w:b w:val="0"/>
+          <w:bCs w:val="0"/>
+          <w:kern w:val="0"/>
+          <w:sz w:val="25"/>
+          <w:szCs w:val="25"/>
+          <w:lang w:val="en-US" w:eastAsia="zh-CN" w:bidi="ar"/>
+        </w:rPr>
+        <w:t xml:space="preserve">, the </w:t>
+      </w:r>
+      <w:r>
+        <w:rPr>
+          <w:rFonts w:hint="default" w:ascii="Times New Roman" w:hAnsi="Times New Roman" w:eastAsia="sans-serif" w:cs="Times New Roman"/>
+          <w:b w:val="0"/>
+          <w:bCs w:val="0"/>
+          <w:kern w:val="0"/>
+          <w:sz w:val="25"/>
+          <w:szCs w:val="25"/>
+          <w:lang w:val="en-US" w:eastAsia="zh-CN" w:bidi="ar"/>
+        </w:rPr>
+        <w:t>Training History</w:t>
+      </w:r>
+      <w:r>
+        <w:rPr>
+          <w:rFonts w:hint="default" w:ascii="Times New Roman" w:hAnsi="Times New Roman" w:eastAsia="SimSun" w:cs="Times New Roman"/>
+          <w:b w:val="0"/>
+          <w:bCs w:val="0"/>
+          <w:kern w:val="0"/>
+          <w:sz w:val="25"/>
+          <w:szCs w:val="25"/>
+          <w:lang w:val="en-US" w:eastAsia="zh-CN" w:bidi="ar"/>
+        </w:rPr>
+        <w:t xml:space="preserve"> section provides a graphical representation of loss and convergence over 100 epochs, which is vital for monitoring model stability. Particularly, the system includes a 'Training Tips' panel to assist in optimizing critical hyperparameters like learning rate and batch size. By centralizing these analytics, I believe that the platform ensures the selection of the most precise model for the Boroondara traffic forecasting tasks.</w:t>
+      </w:r>
+    </w:p>
+    <w:p>
+      <w:pPr>
+        <w:pStyle w:val="3"/>
+        <w:numPr>
+          <w:ilvl w:val="0"/>
+          <w:numId w:val="0"/>
+        </w:numPr>
+        <w:bidi w:val="0"/>
+        <w:ind w:leftChars="0"/>
+        <w:jc w:val="both"/>
+        <w:rPr>
+          <w:rFonts w:hint="default"/>
+          <w:lang w:val="en-US"/>
+        </w:rPr>
+      </w:pPr>
+      <w:r>
+        <w:rPr>
+          <w:rFonts w:hint="default"/>
+          <w:lang w:val="en-US"/>
+        </w:rPr>
+        <w:t>2.4 Analytics Page</w:t>
+      </w:r>
+    </w:p>
+    <w:p>
+      <w:pPr>
+        <w:rPr>
+          <w:rFonts w:hint="default"/>
+          <w:lang w:val="en-US"/>
+        </w:rPr>
+      </w:pPr>
+      <w:r>
+        <w:rPr>
+          <w:rFonts w:hint="default"/>
+          <w:lang w:val="en-US"/>
+        </w:rPr>
+        <w:drawing>
+          <wp:anchor distT="0" distB="0" distL="114300" distR="114300" simplePos="0" relativeHeight="251662336" behindDoc="0" locked="0" layoutInCell="1" allowOverlap="1">
+            <wp:simplePos x="0" y="0"/>
+            <wp:positionH relativeFrom="column">
+              <wp:posOffset>419735</wp:posOffset>
+            </wp:positionH>
+            <wp:positionV relativeFrom="paragraph">
+              <wp:posOffset>0</wp:posOffset>
+            </wp:positionV>
+            <wp:extent cx="4438650" cy="2522855"/>
+            <wp:effectExtent l="0" t="0" r="11430" b="6985"/>
+            <wp:wrapSquare wrapText="bothSides"/>
+            <wp:docPr id="6" name="Picture 6" descr="Analytics page"/>
+            <wp:cNvGraphicFramePr>
+              <a:graphicFrameLocks xmlns:a="http://schemas.openxmlformats.org/drawingml/2006/main" noChangeAspect="1"/>
+            </wp:cNvGraphicFramePr>
+            <a:graphic xmlns:a="http://schemas.openxmlformats.org/drawingml/2006/main">
+              <a:graphicData uri="http://schemas.openxmlformats.org/drawingml/2006/picture">
+                <pic:pic xmlns:pic="http://schemas.openxmlformats.org/drawingml/2006/picture">
+                  <pic:nvPicPr>
+                    <pic:cNvPr id="6" name="Picture 6" descr="Analytics page"/>
+                    <pic:cNvPicPr>
+                      <a:picLocks noChangeAspect="1"/>
+                    </pic:cNvPicPr>
+                  </pic:nvPicPr>
+                  <pic:blipFill>
+                    <a:blip r:embed="rId11"/>
+                    <a:stretch>
+                      <a:fillRect/>
+                    </a:stretch>
+                  </pic:blipFill>
+                  <pic:spPr>
+                    <a:xfrm>
+                      <a:off x="0" y="0"/>
+                      <a:ext cx="4438650" cy="2522855"/>
+                    </a:xfrm>
+                    <a:prstGeom prst="rect">
+                      <a:avLst/>
+                    </a:prstGeom>
+                  </pic:spPr>
+                </pic:pic>
+              </a:graphicData>
+            </a:graphic>
+          </wp:anchor>
+        </w:drawing>
+      </w:r>
+    </w:p>
+    <w:p>
+      <w:pPr>
+        <w:numPr>
+          <w:ilvl w:val="0"/>
+          <w:numId w:val="0"/>
+        </w:numPr>
+        <w:ind w:leftChars="0"/>
+        <w:jc w:val="center"/>
+        <w:rPr>
+          <w:rFonts w:hint="default" w:ascii="Times New Roman" w:hAnsi="Times New Roman" w:eastAsia="SimSun" w:cs="Times New Roman"/>
+          <w:b/>
+          <w:bCs/>
+          <w:i/>
+          <w:iCs/>
+          <w:sz w:val="21"/>
+          <w:szCs w:val="21"/>
+        </w:rPr>
+      </w:pPr>
+      <w:r>
+        <w:rPr>
+          <w:rFonts w:hint="default" w:ascii="Times New Roman" w:hAnsi="Times New Roman" w:eastAsia="SimSun" w:cs="Times New Roman"/>
+          <w:b w:val="0"/>
+          <w:bCs w:val="0"/>
+          <w:i w:val="0"/>
+          <w:iCs w:val="0"/>
+          <w:sz w:val="25"/>
+          <w:szCs w:val="25"/>
+          <w:lang w:val="en-US"/>
+        </w:rPr>
+        <w:br w:type="textWrapping"/>
+      </w:r>
+      <w:r>
+        <w:rPr>
+          <w:rFonts w:hint="default" w:ascii="Times New Roman" w:hAnsi="Times New Roman" w:eastAsia="SimSun" w:cs="Times New Roman"/>
+          <w:b w:val="0"/>
+          <w:bCs w:val="0"/>
+          <w:i w:val="0"/>
+          <w:iCs w:val="0"/>
+          <w:sz w:val="25"/>
+          <w:szCs w:val="25"/>
+          <w:lang w:val="en-US"/>
+        </w:rPr>
+        <w:br w:type="textWrapping"/>
+      </w:r>
+      <w:r>
+        <w:rPr>
+          <w:rFonts w:hint="default" w:ascii="Times New Roman" w:hAnsi="Times New Roman" w:eastAsia="SimSun" w:cs="Times New Roman"/>
+          <w:b w:val="0"/>
+          <w:bCs w:val="0"/>
+          <w:i w:val="0"/>
+          <w:iCs w:val="0"/>
+          <w:sz w:val="25"/>
+          <w:szCs w:val="25"/>
+          <w:lang w:val="en-US"/>
+        </w:rPr>
+        <w:br w:type="textWrapping"/>
+      </w:r>
+      <w:r>
+        <w:rPr>
+          <w:rFonts w:hint="default" w:ascii="Times New Roman" w:hAnsi="Times New Roman" w:eastAsia="SimSun" w:cs="Times New Roman"/>
+          <w:b w:val="0"/>
+          <w:bCs w:val="0"/>
+          <w:i w:val="0"/>
+          <w:iCs w:val="0"/>
+          <w:sz w:val="25"/>
+          <w:szCs w:val="25"/>
+          <w:lang w:val="en-US"/>
+        </w:rPr>
+        <w:br w:type="textWrapping"/>
+      </w:r>
+      <w:r>
+        <w:rPr>
+          <w:rFonts w:hint="default" w:ascii="Times New Roman" w:hAnsi="Times New Roman" w:eastAsia="SimSun" w:cs="Times New Roman"/>
+          <w:b w:val="0"/>
+          <w:bCs w:val="0"/>
+          <w:i w:val="0"/>
+          <w:iCs w:val="0"/>
+          <w:sz w:val="25"/>
+          <w:szCs w:val="25"/>
+          <w:lang w:val="en-US"/>
+        </w:rPr>
+        <w:br w:type="textWrapping"/>
+      </w:r>
+      <w:r>
+        <w:rPr>
+          <w:rFonts w:hint="default" w:ascii="Times New Roman" w:hAnsi="Times New Roman" w:eastAsia="SimSun" w:cs="Times New Roman"/>
+          <w:b w:val="0"/>
+          <w:bCs w:val="0"/>
+          <w:i w:val="0"/>
+          <w:iCs w:val="0"/>
+          <w:sz w:val="25"/>
+          <w:szCs w:val="25"/>
+          <w:lang w:val="en-US"/>
+        </w:rPr>
+        <w:br w:type="textWrapping"/>
+      </w:r>
+      <w:r>
+        <w:rPr>
+          <w:rFonts w:hint="default" w:ascii="Times New Roman" w:hAnsi="Times New Roman" w:eastAsia="SimSun" w:cs="Times New Roman"/>
+          <w:b w:val="0"/>
+          <w:bCs w:val="0"/>
+          <w:i w:val="0"/>
+          <w:iCs w:val="0"/>
+          <w:sz w:val="25"/>
+          <w:szCs w:val="25"/>
+          <w:lang w:val="en-US"/>
+        </w:rPr>
+        <w:br w:type="textWrapping"/>
+      </w:r>
+      <w:r>
+        <w:rPr>
+          <w:rFonts w:hint="default" w:ascii="Times New Roman" w:hAnsi="Times New Roman" w:eastAsia="SimSun" w:cs="Times New Roman"/>
+          <w:b w:val="0"/>
+          <w:bCs w:val="0"/>
+          <w:i w:val="0"/>
+          <w:iCs w:val="0"/>
+          <w:sz w:val="25"/>
+          <w:szCs w:val="25"/>
+          <w:lang w:val="en-US"/>
+        </w:rPr>
+        <w:br w:type="textWrapping"/>
+      </w:r>
+      <w:r>
+        <w:rPr>
+          <w:rFonts w:hint="default" w:ascii="Times New Roman" w:hAnsi="Times New Roman" w:eastAsia="SimSun" w:cs="Times New Roman"/>
+          <w:b w:val="0"/>
+          <w:bCs w:val="0"/>
+          <w:i w:val="0"/>
+          <w:iCs w:val="0"/>
+          <w:sz w:val="25"/>
+          <w:szCs w:val="25"/>
+          <w:lang w:val="en-US"/>
+        </w:rPr>
+        <w:br w:type="textWrapping"/>
+      </w:r>
+      <w:r>
+        <w:rPr>
+          <w:rFonts w:hint="default" w:ascii="Times New Roman" w:hAnsi="Times New Roman" w:eastAsia="SimSun" w:cs="Times New Roman"/>
+          <w:b w:val="0"/>
+          <w:bCs w:val="0"/>
+          <w:i w:val="0"/>
+          <w:iCs w:val="0"/>
+          <w:sz w:val="25"/>
+          <w:szCs w:val="25"/>
+          <w:lang w:val="en-US"/>
+        </w:rPr>
+        <w:br w:type="textWrapping"/>
+      </w:r>
+      <w:r>
+        <w:rPr>
+          <w:rFonts w:hint="default" w:ascii="Times New Roman" w:hAnsi="Times New Roman" w:eastAsia="SimSun" w:cs="Times New Roman"/>
+          <w:b w:val="0"/>
+          <w:bCs w:val="0"/>
+          <w:i w:val="0"/>
+          <w:iCs w:val="0"/>
+          <w:sz w:val="25"/>
+          <w:szCs w:val="25"/>
+          <w:lang w:val="en-US"/>
+        </w:rPr>
+        <w:br w:type="textWrapping"/>
+      </w:r>
+      <w:r>
+        <w:rPr>
+          <w:rFonts w:hint="default" w:ascii="Times New Roman" w:hAnsi="Times New Roman" w:eastAsia="SimSun" w:cs="Times New Roman"/>
+          <w:b w:val="0"/>
+          <w:bCs w:val="0"/>
+          <w:i w:val="0"/>
+          <w:iCs w:val="0"/>
+          <w:sz w:val="25"/>
+          <w:szCs w:val="25"/>
+          <w:lang w:val="en-US"/>
+        </w:rPr>
+        <w:br w:type="textWrapping"/>
+      </w:r>
+      <w:r>
+        <w:rPr>
+          <w:rFonts w:hint="default" w:ascii="Times New Roman" w:hAnsi="Times New Roman" w:eastAsia="SimSun" w:cs="Times New Roman"/>
+          <w:b/>
+          <w:bCs/>
+          <w:i/>
+          <w:iCs/>
+          <w:sz w:val="21"/>
+          <w:szCs w:val="21"/>
+          <w:lang w:val="en-US"/>
+        </w:rPr>
+        <w:t xml:space="preserve">Figure 4: Analytics </w:t>
+      </w:r>
+      <w:r>
+        <w:rPr>
+          <w:rFonts w:hint="default" w:ascii="Times New Roman" w:hAnsi="Times New Roman" w:eastAsia="SimSun" w:cs="Times New Roman"/>
+          <w:b/>
+          <w:bCs/>
+          <w:i/>
+          <w:iCs/>
+          <w:sz w:val="21"/>
+          <w:szCs w:val="21"/>
+        </w:rPr>
+        <w:t>Dashboard for Traffic Flow Trends and Model Validation.</w:t>
+      </w:r>
+    </w:p>
+    <w:p>
+      <w:pPr>
+        <w:pStyle w:val="18"/>
+        <w:keepNext w:val="0"/>
+        <w:keepLines w:val="0"/>
+        <w:widowControl/>
+        <w:suppressLineNumbers w:val="0"/>
+        <w:jc w:val="both"/>
+        <w:rPr>
+          <w:b w:val="0"/>
+          <w:bCs w:val="0"/>
+        </w:rPr>
+      </w:pPr>
+      <w:r>
+        <w:rPr>
+          <w:rFonts w:hint="default" w:ascii="Times New Roman" w:hAnsi="Times New Roman" w:eastAsia="SimSun" w:cs="Times New Roman"/>
+          <w:b w:val="0"/>
+          <w:bCs w:val="0"/>
+          <w:i w:val="0"/>
+          <w:iCs w:val="0"/>
+          <w:sz w:val="25"/>
+          <w:szCs w:val="25"/>
+          <w:lang w:val="en-US"/>
+        </w:rPr>
+        <w:t>Finally,</w:t>
+      </w:r>
+      <w:r>
+        <w:rPr>
+          <w:rFonts w:hint="default" w:ascii="Times New Roman" w:hAnsi="Times New Roman" w:eastAsia="SimSun" w:cs="Times New Roman"/>
+          <w:b w:val="0"/>
+          <w:bCs w:val="0"/>
+          <w:i/>
+          <w:iCs/>
+          <w:sz w:val="25"/>
+          <w:szCs w:val="25"/>
+          <w:lang w:val="en-US"/>
+        </w:rPr>
+        <w:t xml:space="preserve"> </w:t>
+      </w:r>
+      <w:r>
+        <w:rPr>
+          <w:rFonts w:hint="default" w:ascii="Times New Roman" w:hAnsi="Times New Roman" w:eastAsia="SimSun" w:cs="Times New Roman"/>
+          <w:b/>
+          <w:bCs/>
+          <w:i/>
+          <w:iCs/>
+          <w:sz w:val="25"/>
+          <w:szCs w:val="25"/>
+          <w:lang w:val="en-US"/>
+        </w:rPr>
+        <w:t>Figure 4</w:t>
+      </w:r>
+      <w:r>
+        <w:rPr>
+          <w:rFonts w:hint="default" w:ascii="Times New Roman" w:hAnsi="Times New Roman" w:eastAsia="SimSun" w:cs="Times New Roman"/>
+          <w:b w:val="0"/>
+          <w:bCs w:val="0"/>
+          <w:i/>
+          <w:iCs/>
+          <w:sz w:val="25"/>
+          <w:szCs w:val="25"/>
+          <w:lang w:val="en-US"/>
+        </w:rPr>
+        <w:t xml:space="preserve"> re</w:t>
+      </w:r>
+      <w:r>
+        <w:rPr>
+          <w:b w:val="0"/>
+          <w:bCs w:val="0"/>
+        </w:rPr>
+        <w:t>presents the Analytics page</w:t>
+      </w:r>
+      <w:r>
+        <w:rPr>
+          <w:rFonts w:hint="default"/>
+          <w:b w:val="0"/>
+          <w:bCs w:val="0"/>
+          <w:lang w:val="en-US"/>
+        </w:rPr>
+        <w:t xml:space="preserve"> </w:t>
+      </w:r>
+      <w:r>
+        <w:rPr>
+          <w:b w:val="0"/>
+          <w:bCs w:val="0"/>
+        </w:rPr>
+        <w:t xml:space="preserve">which serves as the final interpretive layer of the system, transforming raw predictive data into strategic insights for urban management. </w:t>
+      </w:r>
+      <w:r>
+        <w:rPr>
+          <w:rFonts w:hint="default"/>
+          <w:b w:val="0"/>
+          <w:bCs w:val="0"/>
+          <w:lang w:val="en-US"/>
+        </w:rPr>
+        <w:t>In detail, t</w:t>
+      </w:r>
+      <w:r>
+        <w:rPr>
+          <w:b w:val="0"/>
+          <w:bCs w:val="0"/>
+        </w:rPr>
+        <w:t xml:space="preserve">he </w:t>
+      </w:r>
+      <w:r>
+        <w:rPr>
+          <w:rFonts w:hint="default"/>
+          <w:b w:val="0"/>
+          <w:bCs w:val="0"/>
+          <w:lang w:val="en-US"/>
+        </w:rPr>
+        <w:t>page</w:t>
+      </w:r>
+      <w:r>
+        <w:rPr>
+          <w:b w:val="0"/>
+          <w:bCs w:val="0"/>
+        </w:rPr>
+        <w:t xml:space="preserve"> is structured into three primary functional areas:</w:t>
+      </w:r>
+    </w:p>
+    <w:p>
+      <w:pPr>
+        <w:pStyle w:val="18"/>
+        <w:keepNext w:val="0"/>
+        <w:keepLines w:val="0"/>
+        <w:widowControl/>
+        <w:numPr>
+          <w:ilvl w:val="0"/>
+          <w:numId w:val="2"/>
+        </w:numPr>
+        <w:suppressLineNumbers w:val="0"/>
+        <w:tabs>
+          <w:tab w:val="clear" w:pos="420"/>
+        </w:tabs>
+        <w:spacing w:before="0" w:beforeAutospacing="0" w:line="14" w:lineRule="atLeast"/>
+        <w:ind w:left="880" w:leftChars="0" w:hanging="420" w:firstLineChars="0"/>
+        <w:jc w:val="both"/>
+        <w:rPr>
+          <w:rFonts w:hint="default" w:ascii="Times New Roman" w:hAnsi="Times New Roman" w:cs="Times New Roman"/>
+          <w:b w:val="0"/>
+          <w:bCs w:val="0"/>
+          <w:sz w:val="25"/>
+          <w:szCs w:val="25"/>
+        </w:rPr>
+      </w:pPr>
+      <w:r>
+        <w:rPr>
+          <w:rFonts w:hint="default" w:ascii="Times New Roman" w:hAnsi="Times New Roman" w:eastAsia="SimSun" w:cs="Times New Roman"/>
+          <w:b w:val="0"/>
+          <w:bCs w:val="0"/>
+          <w:sz w:val="25"/>
+          <w:szCs w:val="25"/>
+        </w:rPr>
+        <w:t xml:space="preserve">Temporal Traffic Visualization: </w:t>
+      </w:r>
+      <w:r>
+        <w:rPr>
+          <w:rFonts w:hint="default" w:ascii="Times New Roman" w:hAnsi="Times New Roman" w:eastAsia="SimSun" w:cs="Times New Roman"/>
+          <w:b w:val="0"/>
+          <w:bCs w:val="0"/>
+          <w:sz w:val="25"/>
+          <w:szCs w:val="25"/>
+          <w:lang w:val="en-US"/>
+        </w:rPr>
+        <w:t>First</w:t>
+      </w:r>
+      <w:r>
+        <w:rPr>
+          <w:rFonts w:hint="default" w:ascii="Times New Roman" w:hAnsi="Times New Roman" w:eastAsia="SimSun" w:cs="Times New Roman"/>
+          <w:b w:val="0"/>
+          <w:bCs w:val="0"/>
+          <w:sz w:val="25"/>
+          <w:szCs w:val="25"/>
+        </w:rPr>
+        <w:t xml:space="preserve"> component features dynamic charts that visualize traffic volume fluctuations over specific time intervals. </w:t>
+      </w:r>
+      <w:r>
+        <w:rPr>
+          <w:rFonts w:hint="default" w:ascii="Times New Roman" w:hAnsi="Times New Roman" w:eastAsia="SimSun" w:cs="Times New Roman"/>
+          <w:b w:val="0"/>
+          <w:bCs w:val="0"/>
+          <w:sz w:val="25"/>
+          <w:szCs w:val="25"/>
+          <w:lang w:val="en-US"/>
+        </w:rPr>
+        <w:t>Therefore, i</w:t>
+      </w:r>
+      <w:r>
+        <w:rPr>
+          <w:rFonts w:hint="default" w:ascii="Times New Roman" w:hAnsi="Times New Roman" w:eastAsia="SimSun" w:cs="Times New Roman"/>
+          <w:b w:val="0"/>
+          <w:bCs w:val="0"/>
+          <w:sz w:val="25"/>
+          <w:szCs w:val="25"/>
+        </w:rPr>
+        <w:t>t allows for the identification of cyclical congestion patterns and peak-hour trends within the Boroondara network, providing a baseline for historical data analysis.</w:t>
+      </w:r>
+    </w:p>
+    <w:p>
+      <w:pPr>
+        <w:pStyle w:val="18"/>
+        <w:keepNext w:val="0"/>
+        <w:keepLines w:val="0"/>
+        <w:widowControl/>
+        <w:numPr>
+          <w:ilvl w:val="0"/>
+          <w:numId w:val="2"/>
+        </w:numPr>
+        <w:suppressLineNumbers w:val="0"/>
+        <w:tabs>
+          <w:tab w:val="clear" w:pos="420"/>
+        </w:tabs>
+        <w:spacing w:before="0" w:beforeAutospacing="0" w:line="14" w:lineRule="atLeast"/>
+        <w:ind w:left="880" w:leftChars="0" w:hanging="420" w:firstLineChars="0"/>
+        <w:jc w:val="both"/>
+        <w:rPr>
+          <w:rFonts w:hint="default" w:ascii="Times New Roman" w:hAnsi="Times New Roman" w:cs="Times New Roman"/>
+          <w:b w:val="0"/>
+          <w:bCs w:val="0"/>
+          <w:sz w:val="25"/>
+          <w:szCs w:val="25"/>
+        </w:rPr>
+      </w:pPr>
+      <w:r>
+        <w:rPr>
+          <w:rFonts w:hint="default" w:ascii="Times New Roman" w:hAnsi="Times New Roman" w:cs="Times New Roman"/>
+          <w:b w:val="0"/>
+          <w:bCs w:val="0"/>
+          <w:sz w:val="25"/>
+          <w:szCs w:val="25"/>
+        </w:rPr>
+        <w:t xml:space="preserve">Predictive Performance Validation: </w:t>
+      </w:r>
+      <w:r>
+        <w:rPr>
+          <w:rFonts w:hint="default" w:ascii="Times New Roman" w:hAnsi="Times New Roman" w:cs="Times New Roman"/>
+          <w:b w:val="0"/>
+          <w:bCs w:val="0"/>
+          <w:sz w:val="25"/>
+          <w:szCs w:val="25"/>
+          <w:lang w:val="en-US"/>
+        </w:rPr>
+        <w:t>For</w:t>
+      </w:r>
+      <w:r>
+        <w:rPr>
+          <w:rFonts w:hint="default" w:ascii="Times New Roman" w:hAnsi="Times New Roman" w:cs="Times New Roman"/>
+          <w:b w:val="0"/>
+          <w:bCs w:val="0"/>
+          <w:sz w:val="25"/>
+          <w:szCs w:val="25"/>
+        </w:rPr>
+        <w:t xml:space="preserve"> demonstrat</w:t>
+      </w:r>
+      <w:r>
+        <w:rPr>
+          <w:rFonts w:hint="default" w:ascii="Times New Roman" w:hAnsi="Times New Roman" w:cs="Times New Roman"/>
+          <w:b w:val="0"/>
+          <w:bCs w:val="0"/>
+          <w:sz w:val="25"/>
+          <w:szCs w:val="25"/>
+          <w:lang w:val="en-US"/>
+        </w:rPr>
+        <w:t>ing</w:t>
+      </w:r>
+      <w:r>
+        <w:rPr>
+          <w:rFonts w:hint="default" w:ascii="Times New Roman" w:hAnsi="Times New Roman" w:cs="Times New Roman"/>
+          <w:b w:val="0"/>
+          <w:bCs w:val="0"/>
+          <w:sz w:val="25"/>
+          <w:szCs w:val="25"/>
+        </w:rPr>
+        <w:t xml:space="preserve"> the model's reliability, this section overlays Predicted vs. Actual SCATS sensor data. This comparative visualization provides a transparent assessment of the forecasting accuracy of the selected LSTM or GRU architectures in real-world scenarios.</w:t>
+      </w:r>
+    </w:p>
+    <w:p>
+      <w:pPr>
+        <w:pStyle w:val="18"/>
+        <w:keepNext w:val="0"/>
+        <w:keepLines w:val="0"/>
+        <w:widowControl/>
+        <w:numPr>
+          <w:ilvl w:val="0"/>
+          <w:numId w:val="2"/>
+        </w:numPr>
+        <w:suppressLineNumbers w:val="0"/>
+        <w:tabs>
+          <w:tab w:val="clear" w:pos="420"/>
+        </w:tabs>
+        <w:spacing w:before="0" w:beforeAutospacing="0" w:line="14" w:lineRule="atLeast"/>
+        <w:ind w:left="880" w:leftChars="0" w:hanging="420" w:firstLineChars="0"/>
+        <w:jc w:val="both"/>
+        <w:rPr>
+          <w:rFonts w:hint="default" w:ascii="Times New Roman" w:hAnsi="Times New Roman" w:cs="Times New Roman"/>
+          <w:b w:val="0"/>
+          <w:bCs w:val="0"/>
+          <w:sz w:val="25"/>
+          <w:szCs w:val="25"/>
+        </w:rPr>
+      </w:pPr>
+      <w:r>
+        <w:rPr>
+          <w:rFonts w:hint="default" w:ascii="Times New Roman" w:hAnsi="Times New Roman" w:cs="Times New Roman"/>
+          <w:b w:val="0"/>
+          <w:bCs w:val="0"/>
+          <w:sz w:val="25"/>
+          <w:szCs w:val="25"/>
+        </w:rPr>
+        <w:t>Station Congestion Ranking: By utilizing a data-driven ranking system, the dashboard pinpoints 'bottleneck' intersections based on traffic density and delay metrics</w:t>
+      </w:r>
+      <w:r>
+        <w:rPr>
+          <w:rFonts w:hint="default" w:ascii="Times New Roman" w:hAnsi="Times New Roman" w:cs="Times New Roman"/>
+          <w:b w:val="0"/>
+          <w:bCs w:val="0"/>
+          <w:sz w:val="25"/>
+          <w:szCs w:val="25"/>
+          <w:lang w:val="en-US"/>
+        </w:rPr>
+        <w:t xml:space="preserve"> which</w:t>
+      </w:r>
+      <w:r>
+        <w:rPr>
+          <w:rFonts w:hint="default" w:ascii="Times New Roman" w:hAnsi="Times New Roman" w:cs="Times New Roman"/>
+          <w:b w:val="0"/>
+          <w:bCs w:val="0"/>
+          <w:sz w:val="25"/>
+          <w:szCs w:val="25"/>
+        </w:rPr>
+        <w:t xml:space="preserve"> allows urban planners to prioritize infrastructure interventions at the most high-pressure nodes in the network.</w:t>
+      </w:r>
+    </w:p>
+    <w:p>
+      <w:pPr>
+        <w:pStyle w:val="18"/>
+        <w:keepNext w:val="0"/>
+        <w:keepLines w:val="0"/>
+        <w:widowControl/>
+        <w:suppressLineNumbers w:val="0"/>
+        <w:jc w:val="both"/>
+        <w:rPr>
+          <w:rFonts w:hint="default" w:ascii="Times New Roman" w:hAnsi="Times New Roman" w:eastAsia="SimSun" w:cs="Times New Roman"/>
+          <w:b w:val="0"/>
+          <w:bCs w:val="0"/>
+          <w:sz w:val="25"/>
+          <w:szCs w:val="25"/>
+          <w:lang w:val="en-US"/>
+        </w:rPr>
+      </w:pPr>
+      <w:r>
+        <w:rPr>
+          <w:rFonts w:hint="default" w:ascii="Times New Roman" w:hAnsi="Times New Roman" w:eastAsia="SimSun" w:cs="Times New Roman"/>
+          <w:b w:val="0"/>
+          <w:bCs w:val="0"/>
+          <w:sz w:val="25"/>
+          <w:szCs w:val="25"/>
+        </w:rPr>
+        <w:t xml:space="preserve">In </w:t>
+      </w:r>
+      <w:r>
+        <w:rPr>
+          <w:rFonts w:hint="default" w:ascii="Times New Roman" w:hAnsi="Times New Roman" w:eastAsia="SimSun" w:cs="Times New Roman"/>
+          <w:b w:val="0"/>
+          <w:bCs w:val="0"/>
+          <w:sz w:val="25"/>
+          <w:szCs w:val="25"/>
+          <w:lang w:val="en-US"/>
+        </w:rPr>
+        <w:t>summary</w:t>
+      </w:r>
+      <w:r>
+        <w:rPr>
+          <w:rFonts w:hint="default" w:ascii="Times New Roman" w:hAnsi="Times New Roman" w:eastAsia="SimSun" w:cs="Times New Roman"/>
+          <w:b w:val="0"/>
+          <w:bCs w:val="0"/>
+          <w:sz w:val="25"/>
+          <w:szCs w:val="25"/>
+        </w:rPr>
+        <w:t>, the technical implementation of the system successfully i</w:t>
+      </w:r>
+      <w:r>
+        <w:rPr>
+          <w:rFonts w:hint="default" w:ascii="Times New Roman" w:hAnsi="Times New Roman" w:eastAsia="SimSun" w:cs="Times New Roman"/>
+          <w:b w:val="0"/>
+          <w:bCs w:val="0"/>
+          <w:sz w:val="25"/>
+          <w:szCs w:val="25"/>
+          <w:lang w:val="en-US"/>
+        </w:rPr>
+        <w:t>mplements</w:t>
+      </w:r>
+      <w:r>
+        <w:rPr>
+          <w:rFonts w:hint="default" w:ascii="Times New Roman" w:hAnsi="Times New Roman" w:eastAsia="SimSun" w:cs="Times New Roman"/>
+          <w:b w:val="0"/>
+          <w:bCs w:val="0"/>
+          <w:sz w:val="25"/>
+          <w:szCs w:val="25"/>
+        </w:rPr>
+        <w:t xml:space="preserve"> AI-driven forecasting with interactive pathfinding to enhance urban mobility. </w:t>
+      </w:r>
+      <w:r>
+        <w:rPr>
+          <w:rFonts w:hint="default" w:ascii="Times New Roman" w:hAnsi="Times New Roman" w:eastAsia="SimSun" w:cs="Times New Roman"/>
+          <w:b w:val="0"/>
+          <w:bCs w:val="0"/>
+          <w:sz w:val="25"/>
+          <w:szCs w:val="25"/>
+          <w:lang w:val="en-US"/>
+        </w:rPr>
+        <w:t>In contrast</w:t>
+      </w:r>
+      <w:r>
+        <w:rPr>
+          <w:rFonts w:hint="default" w:ascii="Times New Roman" w:hAnsi="Times New Roman" w:eastAsia="SimSun" w:cs="Times New Roman"/>
+          <w:b w:val="0"/>
+          <w:bCs w:val="0"/>
+          <w:sz w:val="25"/>
+          <w:szCs w:val="25"/>
+        </w:rPr>
+        <w:t xml:space="preserve">, the deployment of </w:t>
+      </w:r>
+      <w:r>
+        <w:rPr>
+          <w:rFonts w:hint="default" w:ascii="Times New Roman" w:hAnsi="Times New Roman" w:eastAsia="SimSun" w:cs="Times New Roman"/>
+          <w:b w:val="0"/>
+          <w:bCs w:val="0"/>
+          <w:sz w:val="25"/>
+          <w:szCs w:val="25"/>
+          <w:lang w:val="en-US"/>
+        </w:rPr>
+        <w:t>the website</w:t>
+      </w:r>
+      <w:r>
+        <w:rPr>
+          <w:rFonts w:hint="default" w:ascii="Times New Roman" w:hAnsi="Times New Roman" w:eastAsia="SimSun" w:cs="Times New Roman"/>
+          <w:b w:val="0"/>
+          <w:bCs w:val="0"/>
+          <w:sz w:val="25"/>
+          <w:szCs w:val="25"/>
+        </w:rPr>
+        <w:t xml:space="preserve"> introduces significant responsibilities beyond technical performance. As the system directly impacts public data and commuter behavior, it is </w:t>
+      </w:r>
+      <w:r>
+        <w:rPr>
+          <w:rFonts w:hint="default" w:ascii="Times New Roman" w:hAnsi="Times New Roman" w:eastAsia="SimSun" w:cs="Times New Roman"/>
+          <w:b w:val="0"/>
+          <w:bCs w:val="0"/>
+          <w:sz w:val="25"/>
+          <w:szCs w:val="25"/>
+          <w:lang w:val="en-US"/>
+        </w:rPr>
+        <w:t>essential</w:t>
+      </w:r>
+      <w:r>
+        <w:rPr>
+          <w:rFonts w:hint="default" w:ascii="Times New Roman" w:hAnsi="Times New Roman" w:eastAsia="SimSun" w:cs="Times New Roman"/>
+          <w:b w:val="0"/>
+          <w:bCs w:val="0"/>
+          <w:sz w:val="25"/>
+          <w:szCs w:val="25"/>
+        </w:rPr>
+        <w:t xml:space="preserve"> to evaluate its broader societal implications. </w:t>
+      </w:r>
+      <w:r>
+        <w:rPr>
+          <w:rFonts w:hint="default" w:ascii="Times New Roman" w:hAnsi="Times New Roman" w:eastAsia="SimSun" w:cs="Times New Roman"/>
+          <w:b w:val="0"/>
+          <w:bCs w:val="0"/>
+          <w:sz w:val="25"/>
+          <w:szCs w:val="25"/>
+          <w:lang w:val="en-US"/>
+        </w:rPr>
+        <w:t>Notably</w:t>
+      </w:r>
+      <w:r>
+        <w:rPr>
+          <w:rFonts w:hint="default" w:ascii="Times New Roman" w:hAnsi="Times New Roman" w:eastAsia="SimSun" w:cs="Times New Roman"/>
+          <w:b w:val="0"/>
+          <w:bCs w:val="0"/>
+          <w:sz w:val="25"/>
+          <w:szCs w:val="25"/>
+        </w:rPr>
+        <w:t xml:space="preserve">, the following part explores the </w:t>
+      </w:r>
+      <w:r>
+        <w:rPr>
+          <w:rFonts w:hint="default" w:ascii="Times New Roman" w:hAnsi="Times New Roman" w:eastAsia="SimSun" w:cs="Times New Roman"/>
+          <w:b w:val="0"/>
+          <w:bCs w:val="0"/>
+          <w:sz w:val="25"/>
+          <w:szCs w:val="25"/>
+          <w:lang w:val="en-US"/>
+        </w:rPr>
+        <w:t>e</w:t>
+      </w:r>
+      <w:r>
+        <w:rPr>
+          <w:rFonts w:hint="default" w:ascii="Times New Roman" w:hAnsi="Times New Roman" w:eastAsia="SimSun" w:cs="Times New Roman"/>
+          <w:b w:val="0"/>
+          <w:bCs w:val="0"/>
+          <w:sz w:val="25"/>
+          <w:szCs w:val="25"/>
+        </w:rPr>
+        <w:t xml:space="preserve">thical </w:t>
+      </w:r>
+      <w:r>
+        <w:rPr>
+          <w:rFonts w:hint="default" w:ascii="Times New Roman" w:hAnsi="Times New Roman" w:eastAsia="SimSun" w:cs="Times New Roman"/>
+          <w:b w:val="0"/>
+          <w:bCs w:val="0"/>
+          <w:sz w:val="25"/>
+          <w:szCs w:val="25"/>
+          <w:lang w:val="en-US"/>
+        </w:rPr>
+        <w:t>i</w:t>
+      </w:r>
+      <w:r>
+        <w:rPr>
+          <w:rFonts w:hint="default" w:ascii="Times New Roman" w:hAnsi="Times New Roman" w:eastAsia="SimSun" w:cs="Times New Roman"/>
+          <w:b w:val="0"/>
+          <w:bCs w:val="0"/>
+          <w:sz w:val="25"/>
+          <w:szCs w:val="25"/>
+        </w:rPr>
+        <w:t>ssues of this project, addressing data privacy, algorithmic fairness, and accountability in automated traffic management</w:t>
+      </w:r>
+      <w:r>
+        <w:rPr>
+          <w:rFonts w:hint="default" w:ascii="Times New Roman" w:hAnsi="Times New Roman" w:eastAsia="SimSun" w:cs="Times New Roman"/>
+          <w:b w:val="0"/>
+          <w:bCs w:val="0"/>
+          <w:sz w:val="25"/>
+          <w:szCs w:val="25"/>
+          <w:lang w:val="en-US"/>
+        </w:rPr>
+        <w:t>.</w:t>
+      </w:r>
+    </w:p>
+    <w:p>
+      <w:pPr>
+        <w:pStyle w:val="2"/>
+        <w:bidi w:val="0"/>
+        <w:rPr>
+          <w:rFonts w:hint="default"/>
+          <w:lang w:val="en-US"/>
+        </w:rPr>
+      </w:pPr>
+      <w:r>
+        <w:rPr>
+          <w:rFonts w:hint="default"/>
+          <w:lang w:val="en-US"/>
+        </w:rPr>
+        <w:t>Part C: Ethical Issues</w:t>
+      </w:r>
+    </w:p>
+    <w:p>
+      <w:pPr>
+        <w:jc w:val="both"/>
+        <w:rPr>
+          <w:rFonts w:hint="default" w:ascii="Times New Roman" w:hAnsi="Times New Roman" w:cs="Times New Roman"/>
+          <w:sz w:val="25"/>
+          <w:szCs w:val="25"/>
+          <w:lang w:val="en-US"/>
+        </w:rPr>
+      </w:pPr>
+      <w:r>
+        <w:rPr>
+          <w:rFonts w:hint="default" w:ascii="Times New Roman" w:hAnsi="Times New Roman" w:cs="Times New Roman"/>
+          <w:sz w:val="25"/>
+          <w:szCs w:val="25"/>
+          <w:lang w:val="en-US"/>
+        </w:rPr>
+        <w:t>Then, this part mainly focuses on the ethical responsibilities of AI-driven systems. As the platform influences public data and commuter behavior, it is essential to evaluate its societal impact. In detail, the following section specifically addresses data privacy, algorithmic fairness, and accountability in automated traffic management. By analyzing these pillars, the project of Assignment 2B ensures innovation remains aligned with Responsible AI and public trust.</w:t>
+      </w:r>
+      <w:bookmarkStart w:id="9" w:name="_GoBack"/>
+      <w:bookmarkEnd w:id="9"/>
+    </w:p>
+    <w:p>
+      <w:pPr>
+        <w:pStyle w:val="3"/>
+        <w:numPr>
+          <w:ilvl w:val="0"/>
+          <w:numId w:val="0"/>
+        </w:numPr>
+        <w:bidi w:val="0"/>
+        <w:ind w:leftChars="0"/>
+        <w:rPr>
+          <w:rFonts w:hint="default"/>
+          <w:lang w:val="en-US"/>
+        </w:rPr>
+      </w:pPr>
+      <w:r>
+        <w:rPr>
+          <w:rFonts w:hint="default"/>
+          <w:lang w:val="en-US"/>
+        </w:rPr>
+        <w:t>3.1 Data Privacy and Security</w:t>
+      </w:r>
+    </w:p>
+    <w:p>
+      <w:pPr>
+        <w:rPr>
+          <w:rFonts w:hint="default"/>
+          <w:lang w:val="en-US"/>
+        </w:rPr>
+      </w:pPr>
+    </w:p>
+    <w:p>
+      <w:pPr>
+        <w:rPr>
+          <w:rFonts w:hint="default"/>
+          <w:lang w:val="en-US"/>
+        </w:rPr>
+      </w:pPr>
+    </w:p>
+    <w:p>
+      <w:pPr>
+        <w:numPr>
+          <w:ilvl w:val="0"/>
+          <w:numId w:val="0"/>
+        </w:numPr>
+        <w:ind w:leftChars="0"/>
+        <w:jc w:val="both"/>
+        <w:rPr>
+          <w:rFonts w:hint="default" w:ascii="Times New Roman" w:hAnsi="Times New Roman" w:eastAsia="SimSun" w:cs="Times New Roman"/>
+          <w:b w:val="0"/>
+          <w:bCs w:val="0"/>
+          <w:i w:val="0"/>
+          <w:iCs w:val="0"/>
           <w:sz w:val="25"/>
           <w:szCs w:val="25"/>
           <w:lang w:val="en-US"/>
@@ -2734,7 +4318,7 @@
       <w:fldChar w:fldCharType="separate"/>
     </w:r>
     <w:r>
-      <w:t>7/04/2026</w:t>
+      <w:t>8/04/2026</w:t>
     </w:r>
     <w:r>
       <w:fldChar w:fldCharType="end"/>

</xml_diff>

<commit_message>
Nearly finish part C
</commit_message>
<xml_diff>
--- a/Assignments/Assignment2/Assignment2c/Assignment2c_Truong Ngoc Gia Hieu_105565520_Report.docx
+++ b/Assignments/Assignment2/Assignment2c/Assignment2c_Truong Ngoc Gia Hieu_105565520_Report.docx
@@ -15,9 +15,9 @@
           <w:lang w:val="en-US"/>
         </w:rPr>
       </w:pPr>
-      <w:bookmarkStart w:id="0" w:name="_Toc19506"/>
-      <w:bookmarkStart w:id="1" w:name="_Toc1248"/>
-      <w:bookmarkStart w:id="2" w:name="_Toc25351"/>
+      <w:bookmarkStart w:id="0" w:name="_Toc25351"/>
+      <w:bookmarkStart w:id="1" w:name="_Toc19506"/>
+      <w:bookmarkStart w:id="2" w:name="_Toc1248"/>
       <w:r>
         <w:rPr>
           <w:rFonts w:hint="default" w:ascii="Times New Roman" w:hAnsi="Times New Roman" w:cs="Times New Roman"/>
@@ -654,9 +654,13 @@
           </m:sSupPr>
           <m:e>
             <m:r>
-              <m:rPr/>
+              <m:rPr>
+                <m:nor/>
+                <m:sty m:val="p"/>
+              </m:rPr>
               <w:rPr>
                 <w:rFonts w:hint="default" w:ascii="Cambria Math" w:hAnsi="Cambria Math" w:cs="Times New Roman"/>
+                <w:i w:val="0"/>
                 <w:caps w:val="0"/>
                 <w:color w:val="auto"/>
                 <w:spacing w:val="0"/>
@@ -684,9 +688,12 @@
           </m:e>
           <m:sup>
             <m:r>
-              <m:rPr/>
+              <m:rPr>
+                <m:nor/>
+              </m:rPr>
               <w:rPr>
                 <w:rFonts w:hint="default" w:ascii="Cambria Math" w:hAnsi="Cambria Math" w:cs="Times New Roman"/>
+                <w:i/>
                 <w:caps w:val="0"/>
                 <w:color w:val="auto"/>
                 <w:spacing w:val="0"/>
@@ -695,7 +702,25 @@
                 <w:shd w:val="clear" w:fill="FFFFFF"/>
                 <w:lang w:val="en-US"/>
               </w:rPr>
-              <m:t>th</m:t>
+              <m:t>t</m:t>
+            </m:r>
+            <m:r>
+              <m:rPr>
+                <m:nor/>
+                <m:sty m:val="p"/>
+              </m:rPr>
+              <w:rPr>
+                <w:rFonts w:hint="default" w:ascii="Cambria Math" w:hAnsi="Cambria Math" w:cs="Times New Roman"/>
+                <w:i w:val="0"/>
+                <w:caps w:val="0"/>
+                <w:color w:val="auto"/>
+                <w:spacing w:val="0"/>
+                <w:sz w:val="25"/>
+                <w:szCs w:val="25"/>
+                <w:shd w:val="clear" w:fill="FFFFFF"/>
+                <w:lang w:val="en-US"/>
+              </w:rPr>
+              <m:t>h</m:t>
             </m:r>
             <m:ctrlPr>
               <w:rPr>
@@ -893,9 +918,9 @@
           <w:shd w:val="clear" w:color="auto" w:fill="auto"/>
         </w:rPr>
       </w:pPr>
-      <w:bookmarkStart w:id="6" w:name="_Toc19771"/>
-      <w:bookmarkStart w:id="7" w:name="_Toc3434"/>
-      <w:bookmarkStart w:id="8" w:name="_Toc166571946"/>
+      <w:bookmarkStart w:id="6" w:name="_Toc3434"/>
+      <w:bookmarkStart w:id="7" w:name="_Toc166571946"/>
+      <w:bookmarkStart w:id="8" w:name="_Toc19771"/>
       <w:r>
         <w:rPr>
           <w:rFonts w:hint="default" w:ascii="Times New Roman" w:hAnsi="Times New Roman" w:cs="Times New Roman"/>
@@ -1384,7 +1409,7 @@
         </w:tabs>
         <w:spacing w:line="240" w:lineRule="auto"/>
         <w:rPr>
-          <w:rFonts w:hint="default"/>
+          <w:rFonts w:hint="default" w:ascii="Times New Roman" w:hAnsi="Times New Roman" w:cs="Times New Roman"/>
           <w:lang w:val="en-US"/>
         </w:rPr>
       </w:pPr>
@@ -1562,11 +1587,123 @@
     </w:p>
     <w:p>
       <w:pPr>
-        <w:rPr>
-          <w:rFonts w:hint="default"/>
-          <w:lang w:val="en-US"/>
-        </w:rPr>
-      </w:pPr>
+        <w:pStyle w:val="20"/>
+        <w:tabs>
+          <w:tab w:val="right" w:leader="dot" w:pos="8302"/>
+        </w:tabs>
+        <w:spacing w:line="240" w:lineRule="auto"/>
+        <w:rPr>
+          <w:rFonts w:hint="default" w:ascii="Times New Roman" w:hAnsi="Times New Roman" w:cs="Times New Roman"/>
+          <w:lang w:val="en-US"/>
+        </w:rPr>
+      </w:pPr>
+      <w:r>
+        <w:rPr>
+          <w:rFonts w:hint="default" w:ascii="Times New Roman" w:hAnsi="Times New Roman" w:cs="Times New Roman"/>
+          <w:b/>
+          <w:bCs/>
+          <w:color w:val="auto"/>
+          <w:sz w:val="32"/>
+          <w:szCs w:val="32"/>
+          <w:highlight w:val="none"/>
+          <w:shd w:val="clear" w:color="auto" w:fill="auto"/>
+          <w:lang w:val="en-US"/>
+        </w:rPr>
+        <w:t>Part D: Website Enhancements</w:t>
+      </w:r>
+      <w:r>
+        <w:rPr>
+          <w:rFonts w:hint="default" w:ascii="Times New Roman" w:hAnsi="Times New Roman" w:cs="Times New Roman"/>
+          <w:b/>
+          <w:bCs/>
+          <w:color w:val="auto"/>
+          <w:sz w:val="30"/>
+          <w:szCs w:val="30"/>
+          <w:highlight w:val="none"/>
+          <w:shd w:val="clear" w:color="auto" w:fill="auto"/>
+        </w:rPr>
+        <w:tab/>
+      </w:r>
+    </w:p>
+    <w:p>
+      <w:pPr>
+        <w:pStyle w:val="20"/>
+        <w:tabs>
+          <w:tab w:val="right" w:leader="dot" w:pos="8302"/>
+        </w:tabs>
+        <w:spacing w:line="240" w:lineRule="auto"/>
+        <w:rPr>
+          <w:rFonts w:hint="default" w:ascii="Times New Roman" w:hAnsi="Times New Roman" w:cs="Times New Roman"/>
+          <w:lang w:val="en-US"/>
+        </w:rPr>
+      </w:pPr>
+      <w:r>
+        <w:rPr>
+          <w:rFonts w:hint="default" w:ascii="Times New Roman" w:hAnsi="Times New Roman" w:cs="Times New Roman"/>
+          <w:b/>
+          <w:bCs/>
+          <w:color w:val="auto"/>
+          <w:sz w:val="32"/>
+          <w:szCs w:val="32"/>
+          <w:highlight w:val="none"/>
+          <w:shd w:val="clear" w:color="auto" w:fill="auto"/>
+          <w:lang w:val="en-US"/>
+        </w:rPr>
+        <w:t>Part E: Conclusion</w:t>
+      </w:r>
+      <w:r>
+        <w:rPr>
+          <w:rFonts w:hint="default" w:ascii="Times New Roman" w:hAnsi="Times New Roman" w:cs="Times New Roman"/>
+          <w:b/>
+          <w:bCs/>
+          <w:color w:val="auto"/>
+          <w:sz w:val="30"/>
+          <w:szCs w:val="30"/>
+          <w:highlight w:val="none"/>
+          <w:shd w:val="clear" w:color="auto" w:fill="auto"/>
+        </w:rPr>
+        <w:tab/>
+      </w:r>
+    </w:p>
+    <w:p>
+      <w:pPr>
+        <w:pStyle w:val="20"/>
+        <w:tabs>
+          <w:tab w:val="right" w:leader="dot" w:pos="8302"/>
+        </w:tabs>
+        <w:spacing w:line="240" w:lineRule="auto"/>
+        <w:rPr>
+          <w:rFonts w:hint="default" w:ascii="Times New Roman" w:hAnsi="Times New Roman" w:cs="Times New Roman"/>
+          <w:lang w:val="en-US"/>
+        </w:rPr>
+      </w:pPr>
+      <w:r>
+        <w:rPr>
+          <w:rFonts w:hint="default" w:ascii="Times New Roman" w:hAnsi="Times New Roman" w:cs="Times New Roman"/>
+          <w:b/>
+          <w:bCs/>
+          <w:color w:val="auto"/>
+          <w:sz w:val="32"/>
+          <w:szCs w:val="32"/>
+          <w:highlight w:val="none"/>
+          <w:shd w:val="clear" w:color="auto" w:fill="auto"/>
+          <w:lang w:val="en-US"/>
+        </w:rPr>
+        <w:t>Part F: References</w:t>
+      </w:r>
+      <w:r>
+        <w:rPr>
+          <w:rFonts w:hint="default" w:ascii="Times New Roman" w:hAnsi="Times New Roman" w:cs="Times New Roman"/>
+          <w:b/>
+          <w:bCs/>
+          <w:color w:val="auto"/>
+          <w:sz w:val="30"/>
+          <w:szCs w:val="30"/>
+          <w:highlight w:val="none"/>
+          <w:shd w:val="clear" w:color="auto" w:fill="auto"/>
+        </w:rPr>
+        <w:tab/>
+      </w:r>
     </w:p>
     <w:p>
       <w:pPr>
@@ -1846,13 +1983,13 @@
         <w:pStyle w:val="2"/>
         <w:bidi w:val="0"/>
         <w:rPr>
-          <w:rFonts w:hint="default"/>
-          <w:lang w:val="en-US"/>
-        </w:rPr>
-      </w:pPr>
-      <w:r>
-        <w:rPr>
-          <w:rFonts w:hint="default"/>
+          <w:rFonts w:hint="default" w:ascii="Times New Roman" w:hAnsi="Times New Roman" w:cs="Times New Roman"/>
+          <w:lang w:val="en-US"/>
+        </w:rPr>
+      </w:pPr>
+      <w:r>
+        <w:rPr>
+          <w:rFonts w:hint="default" w:ascii="Times New Roman" w:hAnsi="Times New Roman" w:cs="Times New Roman"/>
           <w:lang w:val="en-US"/>
         </w:rPr>
         <w:t>Part A: Abstraction</w:t>
@@ -1867,13 +2004,13 @@
         </w:numPr>
         <w:bidi w:val="0"/>
         <w:rPr>
-          <w:rFonts w:hint="default"/>
-          <w:lang w:val="en-US"/>
-        </w:rPr>
-      </w:pPr>
-      <w:r>
-        <w:rPr>
-          <w:rFonts w:hint="default"/>
+          <w:rFonts w:hint="default" w:ascii="Times New Roman" w:hAnsi="Times New Roman" w:cs="Times New Roman"/>
+          <w:lang w:val="en-US"/>
+        </w:rPr>
+      </w:pPr>
+      <w:r>
+        <w:rPr>
+          <w:rFonts w:hint="default" w:ascii="Times New Roman" w:hAnsi="Times New Roman" w:cs="Times New Roman"/>
           <w:lang w:val="en-US"/>
         </w:rPr>
         <w:t>Assignment Requirement</w:t>
@@ -2117,13 +2254,13 @@
         </w:numPr>
         <w:bidi w:val="0"/>
         <w:rPr>
-          <w:rFonts w:hint="default"/>
-          <w:lang w:val="en-US"/>
-        </w:rPr>
-      </w:pPr>
-      <w:r>
-        <w:rPr>
-          <w:rFonts w:hint="default"/>
+          <w:rFonts w:hint="default" w:ascii="Times New Roman" w:hAnsi="Times New Roman" w:cs="Times New Roman"/>
+          <w:lang w:val="en-US"/>
+        </w:rPr>
+      </w:pPr>
+      <w:r>
+        <w:rPr>
+          <w:rFonts w:hint="default" w:ascii="Times New Roman" w:hAnsi="Times New Roman" w:cs="Times New Roman"/>
           <w:lang w:val="en-US"/>
         </w:rPr>
         <w:t>Executive Summary</w:t>
@@ -2134,13 +2271,13 @@
         <w:pStyle w:val="2"/>
         <w:bidi w:val="0"/>
         <w:rPr>
-          <w:rFonts w:hint="default"/>
-          <w:lang w:val="en-US"/>
-        </w:rPr>
-      </w:pPr>
-      <w:r>
-        <w:rPr>
-          <w:rFonts w:hint="default"/>
+          <w:rFonts w:hint="default" w:ascii="Times New Roman" w:hAnsi="Times New Roman" w:cs="Times New Roman"/>
+          <w:lang w:val="en-US"/>
+        </w:rPr>
+      </w:pPr>
+      <w:r>
+        <w:rPr>
+          <w:rFonts w:hint="default" w:ascii="Times New Roman" w:hAnsi="Times New Roman" w:cs="Times New Roman"/>
           <w:lang w:val="en-US"/>
         </w:rPr>
         <w:t>Part B: Traffic Based-Route Guidance System</w:t>
@@ -2221,13 +2358,13 @@
         <w:bidi w:val="0"/>
         <w:ind w:leftChars="0"/>
         <w:rPr>
-          <w:rFonts w:hint="default"/>
-          <w:lang w:val="en-US"/>
-        </w:rPr>
-      </w:pPr>
-      <w:r>
-        <w:rPr>
-          <w:rFonts w:hint="default"/>
+          <w:rFonts w:hint="default" w:ascii="Times New Roman" w:hAnsi="Times New Roman" w:cs="Times New Roman"/>
+          <w:lang w:val="en-US"/>
+        </w:rPr>
+      </w:pPr>
+      <w:r>
+        <w:rPr>
+          <w:rFonts w:hint="default" w:ascii="Times New Roman" w:hAnsi="Times New Roman" w:cs="Times New Roman"/>
           <w:lang w:val="en-US"/>
         </w:rPr>
         <w:t>2.1 Dashboard Page</w:t>
@@ -2626,7 +2763,7 @@
       </w:r>
       <w:r>
         <w:rPr>
-          <w:rFonts w:hint="eastAsia" w:ascii="SimSun" w:hAnsi="SimSun" w:eastAsia="SimSun" w:cs="SimSun"/>
+          <w:rFonts w:hint="default" w:ascii="Times New Roman" w:hAnsi="Times New Roman" w:eastAsia="SimSun" w:cs="Times New Roman"/>
           <w:b w:val="0"/>
           <w:bCs w:val="0"/>
           <w:i/>
@@ -2712,7 +2849,7 @@
       </w:r>
       <w:r>
         <w:rPr>
-          <w:rFonts w:hint="default"/>
+          <w:rFonts w:hint="default" w:ascii="Times New Roman" w:hAnsi="Times New Roman" w:cs="Times New Roman"/>
           <w:lang w:val="en-US"/>
         </w:rPr>
         <w:t>2.2 Route Planner Page</w:t>
@@ -2743,7 +2880,7 @@
         <w:ind w:leftChars="0"/>
         <w:jc w:val="center"/>
         <w:rPr>
-          <w:rFonts w:hint="default" w:ascii="Times New Roman" w:hAnsi="Times New Roman" w:eastAsia="SimSun"/>
+          <w:rFonts w:hint="default" w:ascii="Times New Roman" w:hAnsi="Times New Roman" w:eastAsia="SimSun" w:cs="Times New Roman"/>
           <w:b/>
           <w:bCs/>
           <w:i/>
@@ -2755,7 +2892,7 @@
       </w:pPr>
       <w:r>
         <w:rPr>
-          <w:rFonts w:hint="default" w:ascii="Times New Roman" w:hAnsi="Times New Roman" w:eastAsia="SimSun"/>
+          <w:rFonts w:hint="default" w:ascii="Times New Roman" w:hAnsi="Times New Roman" w:eastAsia="SimSun" w:cs="Times New Roman"/>
           <w:b/>
           <w:bCs/>
           <w:i/>
@@ -2776,7 +2913,7 @@
         <w:ind w:leftChars="0"/>
         <w:jc w:val="both"/>
         <w:rPr>
-          <w:rFonts w:hint="default" w:ascii="Times New Roman" w:hAnsi="Times New Roman" w:eastAsia="SimSun"/>
+          <w:rFonts w:hint="default" w:ascii="Times New Roman" w:hAnsi="Times New Roman" w:eastAsia="SimSun" w:cs="Times New Roman"/>
           <w:b w:val="0"/>
           <w:bCs w:val="0"/>
           <w:i w:val="0"/>
@@ -2788,7 +2925,7 @@
       </w:pPr>
       <w:r>
         <w:rPr>
-          <w:rFonts w:hint="default" w:ascii="Times New Roman" w:hAnsi="Times New Roman" w:eastAsia="SimSun"/>
+          <w:rFonts w:hint="default" w:ascii="Times New Roman" w:hAnsi="Times New Roman" w:eastAsia="SimSun" w:cs="Times New Roman"/>
           <w:b w:val="0"/>
           <w:bCs w:val="0"/>
           <w:i w:val="0"/>
@@ -2801,7 +2938,7 @@
       </w:r>
       <w:r>
         <w:rPr>
-          <w:rFonts w:hint="default" w:ascii="Times New Roman" w:hAnsi="Times New Roman" w:eastAsia="SimSun"/>
+          <w:rFonts w:hint="default" w:ascii="Times New Roman" w:hAnsi="Times New Roman" w:eastAsia="SimSun" w:cs="Times New Roman"/>
           <w:b/>
           <w:bCs/>
           <w:i/>
@@ -2814,7 +2951,7 @@
       </w:r>
       <w:r>
         <w:rPr>
-          <w:rFonts w:hint="default" w:ascii="Times New Roman" w:hAnsi="Times New Roman" w:eastAsia="SimSun"/>
+          <w:rFonts w:hint="default" w:ascii="Times New Roman" w:hAnsi="Times New Roman" w:eastAsia="SimSun" w:cs="Times New Roman"/>
           <w:b w:val="0"/>
           <w:bCs w:val="0"/>
           <w:i w:val="0"/>
@@ -2837,13 +2974,13 @@
         <w:ind w:leftChars="0"/>
         <w:jc w:val="both"/>
         <w:rPr>
-          <w:rFonts w:hint="default"/>
-          <w:lang w:val="en-US"/>
-        </w:rPr>
-      </w:pPr>
-      <w:r>
-        <w:rPr>
-          <w:rFonts w:hint="default"/>
+          <w:rFonts w:hint="default" w:ascii="Times New Roman" w:hAnsi="Times New Roman" w:cs="Times New Roman"/>
+          <w:lang w:val="en-US"/>
+        </w:rPr>
+      </w:pPr>
+      <w:r>
+        <w:rPr>
+          <w:rFonts w:hint="default" w:ascii="Times New Roman" w:hAnsi="Times New Roman" w:cs="Times New Roman"/>
           <w:lang w:val="en-US"/>
         </w:rPr>
         <w:t>2.3 Model Training Page</w:t>
@@ -2852,13 +2989,13 @@
     <w:p>
       <w:pPr>
         <w:rPr>
-          <w:rFonts w:hint="default"/>
-          <w:lang w:val="en-US"/>
-        </w:rPr>
-      </w:pPr>
-      <w:r>
-        <w:rPr>
-          <w:rFonts w:hint="default"/>
+          <w:rFonts w:hint="default" w:ascii="Times New Roman" w:hAnsi="Times New Roman" w:cs="Times New Roman"/>
+          <w:lang w:val="en-US"/>
+        </w:rPr>
+      </w:pPr>
+      <w:r>
+        <w:rPr>
+          <w:rFonts w:hint="default" w:ascii="Times New Roman" w:hAnsi="Times New Roman" w:cs="Times New Roman"/>
           <w:lang w:val="en-US"/>
         </w:rPr>
         <w:drawing>
@@ -2928,7 +3065,7 @@
       </w:pPr>
       <w:r>
         <w:rPr>
-          <w:rFonts w:hint="default" w:ascii="Times New Roman" w:hAnsi="Times New Roman" w:eastAsia="SimSun"/>
+          <w:rFonts w:hint="default" w:ascii="Times New Roman" w:hAnsi="Times New Roman" w:eastAsia="SimSun" w:cs="Times New Roman"/>
           <w:b w:val="0"/>
           <w:bCs w:val="0"/>
           <w:i w:val="0"/>
@@ -2941,7 +3078,7 @@
       </w:r>
       <w:r>
         <w:rPr>
-          <w:rFonts w:hint="default" w:ascii="Times New Roman" w:hAnsi="Times New Roman" w:eastAsia="SimSun"/>
+          <w:rFonts w:hint="default" w:ascii="Times New Roman" w:hAnsi="Times New Roman" w:eastAsia="SimSun" w:cs="Times New Roman"/>
           <w:b w:val="0"/>
           <w:bCs w:val="0"/>
           <w:i w:val="0"/>
@@ -2954,7 +3091,7 @@
       </w:r>
       <w:r>
         <w:rPr>
-          <w:rFonts w:hint="default" w:ascii="Times New Roman" w:hAnsi="Times New Roman" w:eastAsia="SimSun"/>
+          <w:rFonts w:hint="default" w:ascii="Times New Roman" w:hAnsi="Times New Roman" w:eastAsia="SimSun" w:cs="Times New Roman"/>
           <w:b w:val="0"/>
           <w:bCs w:val="0"/>
           <w:i w:val="0"/>
@@ -2967,7 +3104,7 @@
       </w:r>
       <w:r>
         <w:rPr>
-          <w:rFonts w:hint="default" w:ascii="Times New Roman" w:hAnsi="Times New Roman" w:eastAsia="SimSun"/>
+          <w:rFonts w:hint="default" w:ascii="Times New Roman" w:hAnsi="Times New Roman" w:eastAsia="SimSun" w:cs="Times New Roman"/>
           <w:b w:val="0"/>
           <w:bCs w:val="0"/>
           <w:i w:val="0"/>
@@ -2980,7 +3117,7 @@
       </w:r>
       <w:r>
         <w:rPr>
-          <w:rFonts w:hint="default" w:ascii="Times New Roman" w:hAnsi="Times New Roman" w:eastAsia="SimSun"/>
+          <w:rFonts w:hint="default" w:ascii="Times New Roman" w:hAnsi="Times New Roman" w:eastAsia="SimSun" w:cs="Times New Roman"/>
           <w:b w:val="0"/>
           <w:bCs w:val="0"/>
           <w:i w:val="0"/>
@@ -2993,7 +3130,7 @@
       </w:r>
       <w:r>
         <w:rPr>
-          <w:rFonts w:hint="default" w:ascii="Times New Roman" w:hAnsi="Times New Roman" w:eastAsia="SimSun"/>
+          <w:rFonts w:hint="default" w:ascii="Times New Roman" w:hAnsi="Times New Roman" w:eastAsia="SimSun" w:cs="Times New Roman"/>
           <w:b w:val="0"/>
           <w:bCs w:val="0"/>
           <w:i w:val="0"/>
@@ -3006,7 +3143,7 @@
       </w:r>
       <w:r>
         <w:rPr>
-          <w:rFonts w:hint="default" w:ascii="Times New Roman" w:hAnsi="Times New Roman" w:eastAsia="SimSun"/>
+          <w:rFonts w:hint="default" w:ascii="Times New Roman" w:hAnsi="Times New Roman" w:eastAsia="SimSun" w:cs="Times New Roman"/>
           <w:b w:val="0"/>
           <w:bCs w:val="0"/>
           <w:i w:val="0"/>
@@ -3019,7 +3156,7 @@
       </w:r>
       <w:r>
         <w:rPr>
-          <w:rFonts w:hint="default" w:ascii="Times New Roman" w:hAnsi="Times New Roman" w:eastAsia="SimSun"/>
+          <w:rFonts w:hint="default" w:ascii="Times New Roman" w:hAnsi="Times New Roman" w:eastAsia="SimSun" w:cs="Times New Roman"/>
           <w:b w:val="0"/>
           <w:bCs w:val="0"/>
           <w:i w:val="0"/>
@@ -3032,7 +3169,7 @@
       </w:r>
       <w:r>
         <w:rPr>
-          <w:rFonts w:hint="default" w:ascii="Times New Roman" w:hAnsi="Times New Roman" w:eastAsia="SimSun"/>
+          <w:rFonts w:hint="default" w:ascii="Times New Roman" w:hAnsi="Times New Roman" w:eastAsia="SimSun" w:cs="Times New Roman"/>
           <w:b w:val="0"/>
           <w:bCs w:val="0"/>
           <w:i w:val="0"/>
@@ -3045,7 +3182,7 @@
       </w:r>
       <w:r>
         <w:rPr>
-          <w:rFonts w:hint="default" w:ascii="Times New Roman" w:hAnsi="Times New Roman" w:eastAsia="SimSun"/>
+          <w:rFonts w:hint="default" w:ascii="Times New Roman" w:hAnsi="Times New Roman" w:eastAsia="SimSun" w:cs="Times New Roman"/>
           <w:b w:val="0"/>
           <w:bCs w:val="0"/>
           <w:i w:val="0"/>
@@ -3058,7 +3195,7 @@
       </w:r>
       <w:r>
         <w:rPr>
-          <w:rFonts w:hint="default" w:ascii="Times New Roman" w:hAnsi="Times New Roman" w:eastAsia="SimSun"/>
+          <w:rFonts w:hint="default" w:ascii="Times New Roman" w:hAnsi="Times New Roman" w:eastAsia="SimSun" w:cs="Times New Roman"/>
           <w:b w:val="0"/>
           <w:bCs w:val="0"/>
           <w:i w:val="0"/>
@@ -3071,7 +3208,7 @@
       </w:r>
       <w:r>
         <w:rPr>
-          <w:rFonts w:hint="default" w:ascii="Times New Roman" w:hAnsi="Times New Roman" w:eastAsia="SimSun"/>
+          <w:rFonts w:hint="default" w:ascii="Times New Roman" w:hAnsi="Times New Roman" w:eastAsia="SimSun" w:cs="Times New Roman"/>
           <w:b w:val="0"/>
           <w:bCs w:val="0"/>
           <w:i w:val="0"/>
@@ -3356,13 +3493,13 @@
         <w:ind w:leftChars="0"/>
         <w:jc w:val="both"/>
         <w:rPr>
-          <w:rFonts w:hint="default"/>
-          <w:lang w:val="en-US"/>
-        </w:rPr>
-      </w:pPr>
-      <w:r>
-        <w:rPr>
-          <w:rFonts w:hint="default"/>
+          <w:rFonts w:hint="default" w:ascii="Times New Roman" w:hAnsi="Times New Roman" w:cs="Times New Roman"/>
+          <w:lang w:val="en-US"/>
+        </w:rPr>
+      </w:pPr>
+      <w:r>
+        <w:rPr>
+          <w:rFonts w:hint="default" w:ascii="Times New Roman" w:hAnsi="Times New Roman" w:cs="Times New Roman"/>
           <w:lang w:val="en-US"/>
         </w:rPr>
         <w:t>2.4 Analytics Page</w:t>
@@ -3371,13 +3508,13 @@
     <w:p>
       <w:pPr>
         <w:rPr>
-          <w:rFonts w:hint="default"/>
-          <w:lang w:val="en-US"/>
-        </w:rPr>
-      </w:pPr>
-      <w:r>
-        <w:rPr>
-          <w:rFonts w:hint="default"/>
+          <w:rFonts w:hint="default" w:ascii="Times New Roman" w:hAnsi="Times New Roman" w:cs="Times New Roman"/>
+          <w:lang w:val="en-US"/>
+        </w:rPr>
+      </w:pPr>
+      <w:r>
+        <w:rPr>
+          <w:rFonts w:hint="default" w:ascii="Times New Roman" w:hAnsi="Times New Roman" w:cs="Times New Roman"/>
           <w:lang w:val="en-US"/>
         </w:rPr>
         <w:drawing>
@@ -3636,6 +3773,7 @@
         <w:suppressLineNumbers w:val="0"/>
         <w:jc w:val="both"/>
         <w:rPr>
+          <w:rFonts w:hint="default" w:ascii="Times New Roman" w:hAnsi="Times New Roman" w:cs="Times New Roman"/>
           <w:b w:val="0"/>
           <w:bCs w:val="0"/>
         </w:rPr>
@@ -3694,6 +3832,7 @@
       </w:r>
       <w:r>
         <w:rPr>
+          <w:rFonts w:hint="default" w:ascii="Times New Roman" w:hAnsi="Times New Roman" w:cs="Times New Roman"/>
           <w:b w:val="0"/>
           <w:bCs w:val="0"/>
         </w:rPr>
@@ -3701,7 +3840,7 @@
       </w:r>
       <w:r>
         <w:rPr>
-          <w:rFonts w:hint="default"/>
+          <w:rFonts w:hint="default" w:ascii="Times New Roman" w:hAnsi="Times New Roman" w:cs="Times New Roman"/>
           <w:b w:val="0"/>
           <w:bCs w:val="0"/>
           <w:lang w:val="en-US"/>
@@ -3710,6 +3849,7 @@
       </w:r>
       <w:r>
         <w:rPr>
+          <w:rFonts w:hint="default" w:ascii="Times New Roman" w:hAnsi="Times New Roman" w:cs="Times New Roman"/>
           <w:b w:val="0"/>
           <w:bCs w:val="0"/>
         </w:rPr>
@@ -3717,7 +3857,7 @@
       </w:r>
       <w:r>
         <w:rPr>
-          <w:rFonts w:hint="default"/>
+          <w:rFonts w:hint="default" w:ascii="Times New Roman" w:hAnsi="Times New Roman" w:cs="Times New Roman"/>
           <w:b w:val="0"/>
           <w:bCs w:val="0"/>
           <w:lang w:val="en-US"/>
@@ -3726,6 +3866,7 @@
       </w:r>
       <w:r>
         <w:rPr>
+          <w:rFonts w:hint="default" w:ascii="Times New Roman" w:hAnsi="Times New Roman" w:cs="Times New Roman"/>
           <w:b w:val="0"/>
           <w:bCs w:val="0"/>
         </w:rPr>
@@ -3733,7 +3874,7 @@
       </w:r>
       <w:r>
         <w:rPr>
-          <w:rFonts w:hint="default"/>
+          <w:rFonts w:hint="default" w:ascii="Times New Roman" w:hAnsi="Times New Roman" w:cs="Times New Roman"/>
           <w:b w:val="0"/>
           <w:bCs w:val="0"/>
           <w:lang w:val="en-US"/>
@@ -3742,6 +3883,7 @@
       </w:r>
       <w:r>
         <w:rPr>
+          <w:rFonts w:hint="default" w:ascii="Times New Roman" w:hAnsi="Times New Roman" w:cs="Times New Roman"/>
           <w:b w:val="0"/>
           <w:bCs w:val="0"/>
         </w:rPr>
@@ -4173,13 +4315,13 @@
         <w:pStyle w:val="2"/>
         <w:bidi w:val="0"/>
         <w:rPr>
-          <w:rFonts w:hint="default"/>
-          <w:lang w:val="en-US"/>
-        </w:rPr>
-      </w:pPr>
-      <w:r>
-        <w:rPr>
-          <w:rFonts w:hint="default"/>
+          <w:rFonts w:hint="default" w:ascii="Times New Roman" w:hAnsi="Times New Roman" w:cs="Times New Roman"/>
+          <w:lang w:val="en-US"/>
+        </w:rPr>
+      </w:pPr>
+      <w:r>
+        <w:rPr>
+          <w:rFonts w:hint="default" w:ascii="Times New Roman" w:hAnsi="Times New Roman" w:cs="Times New Roman"/>
           <w:lang w:val="en-US"/>
         </w:rPr>
         <w:t>Part C: Ethical Issues</w:t>
@@ -4204,8 +4346,6 @@
         </w:rPr>
         <w:t>Then, this part mainly focuses on the ethical responsibilities of AI-driven systems. As the platform influences public data and commuter behavior, it is essential to evaluate its societal impact. In detail, the following section specifically addresses data privacy, algorithmic fairness, and accountability in automated traffic management. By analyzing these pillars, the project of Assignment 2B ensures innovation remains aligned with Responsible AI and public trust.</w:t>
       </w:r>
-      <w:bookmarkStart w:id="9" w:name="_GoBack"/>
-      <w:bookmarkEnd w:id="9"/>
     </w:p>
     <w:p>
       <w:pPr>
@@ -4217,30 +4357,744 @@
         <w:bidi w:val="0"/>
         <w:ind w:leftChars="0"/>
         <w:rPr>
+          <w:rFonts w:hint="default" w:ascii="Times New Roman" w:hAnsi="Times New Roman" w:cs="Times New Roman"/>
+          <w:lang w:val="en-US"/>
+        </w:rPr>
+      </w:pPr>
+      <w:r>
+        <w:rPr>
+          <w:rFonts w:hint="default" w:ascii="Times New Roman" w:hAnsi="Times New Roman" w:cs="Times New Roman"/>
+          <w:lang w:val="en-US"/>
+        </w:rPr>
+        <w:t>3.1 Data Privacy and Security</w:t>
+      </w:r>
+    </w:p>
+    <w:p>
+      <w:pPr>
+        <w:jc w:val="both"/>
+        <w:rPr>
+          <w:rFonts w:hint="default" w:ascii="Times New Roman" w:hAnsi="Times New Roman" w:eastAsia="SimSun" w:cs="Times New Roman"/>
+          <w:b w:val="0"/>
+          <w:bCs w:val="0"/>
+          <w:sz w:val="25"/>
+          <w:szCs w:val="25"/>
+        </w:rPr>
+      </w:pPr>
+      <w:r>
+        <w:rPr>
+          <w:rFonts w:hint="default" w:ascii="Times New Roman" w:hAnsi="Times New Roman" w:cs="Times New Roman"/>
+          <w:b w:val="0"/>
+          <w:bCs w:val="0"/>
+          <w:sz w:val="25"/>
+          <w:szCs w:val="25"/>
+          <w:lang w:val="en-US"/>
+        </w:rPr>
+        <w:t xml:space="preserve">In the era of modernization, the protection of </w:t>
+      </w:r>
+      <w:r>
+        <w:rPr>
+          <w:rFonts w:hint="default" w:ascii="Times New Roman" w:hAnsi="Times New Roman" w:eastAsia="SimSun" w:cs="Times New Roman"/>
+          <w:b w:val="0"/>
+          <w:bCs w:val="0"/>
+          <w:sz w:val="25"/>
+          <w:szCs w:val="25"/>
+        </w:rPr>
+        <w:t>individual privacy is no longer optional but a foundational requirement for any AI-driven infrastructure. A</w:t>
+      </w:r>
+      <w:r>
+        <w:rPr>
+          <w:rFonts w:hint="default" w:ascii="Times New Roman" w:hAnsi="Times New Roman" w:eastAsia="SimSun" w:cs="Times New Roman"/>
+          <w:b w:val="0"/>
+          <w:bCs w:val="0"/>
+          <w:sz w:val="25"/>
+          <w:szCs w:val="25"/>
+          <w:lang w:val="en-US"/>
+        </w:rPr>
+        <w:t xml:space="preserve">s reported by </w:t>
+      </w:r>
+      <w:r>
+        <w:rPr>
+          <w:rFonts w:hint="default" w:ascii="Times New Roman" w:hAnsi="Times New Roman" w:eastAsia="SimSun" w:cs="Times New Roman"/>
+          <w:b w:val="0"/>
+          <w:bCs w:val="0"/>
+          <w:sz w:val="25"/>
+          <w:szCs w:val="25"/>
+        </w:rPr>
+        <w:t xml:space="preserve">"Privacy by Design" framework, security must be proactive and embedded into the system architecture from the initial design phase (Cavoukian, 2009). </w:t>
+      </w:r>
+      <w:r>
+        <w:rPr>
+          <w:rFonts w:hint="default" w:ascii="Times New Roman" w:hAnsi="Times New Roman" w:eastAsia="SimSun" w:cs="Times New Roman"/>
+          <w:b w:val="0"/>
+          <w:bCs w:val="0"/>
+          <w:sz w:val="25"/>
+          <w:szCs w:val="25"/>
+          <w:lang w:val="en-US"/>
+        </w:rPr>
+        <w:t>Therefore</w:t>
+      </w:r>
+      <w:r>
+        <w:rPr>
+          <w:rFonts w:hint="default" w:ascii="Times New Roman" w:hAnsi="Times New Roman" w:eastAsia="SimSun" w:cs="Times New Roman"/>
+          <w:b w:val="0"/>
+          <w:bCs w:val="0"/>
+          <w:sz w:val="25"/>
+          <w:szCs w:val="25"/>
+        </w:rPr>
+        <w:t xml:space="preserve">, global AI ethics guidelines emphasize that "technical robustness and safety" are essential to prevent data misuse and ensure public trust </w:t>
+      </w:r>
+      <w:r>
+        <w:rPr>
+          <w:rFonts w:hint="default" w:ascii="Times New Roman" w:hAnsi="Times New Roman" w:eastAsia="SimSun" w:cs="Times New Roman"/>
+          <w:b w:val="0"/>
+          <w:bCs w:val="0"/>
+          <w:sz w:val="25"/>
+          <w:szCs w:val="25"/>
+          <w:lang w:val="en-US"/>
+        </w:rPr>
+        <w:t>(</w:t>
+      </w:r>
+      <w:r>
+        <w:rPr>
+          <w:rFonts w:hint="default" w:ascii="Times New Roman" w:hAnsi="Times New Roman" w:eastAsia="SimSun" w:cs="Times New Roman"/>
+          <w:b w:val="0"/>
+          <w:bCs w:val="0"/>
+          <w:sz w:val="25"/>
+          <w:szCs w:val="25"/>
+        </w:rPr>
+        <w:t>Jobin et al., 2019).</w:t>
+      </w:r>
+    </w:p>
+    <w:p>
+      <w:pPr>
+        <w:jc w:val="both"/>
+        <w:rPr>
+          <w:rFonts w:hint="default" w:ascii="Times New Roman" w:hAnsi="Times New Roman" w:eastAsia="SimSun" w:cs="Times New Roman"/>
+          <w:sz w:val="25"/>
+          <w:szCs w:val="25"/>
+        </w:rPr>
+      </w:pPr>
+      <w:r>
+        <w:rPr>
+          <w:rFonts w:hint="default" w:ascii="Times New Roman" w:hAnsi="Times New Roman" w:eastAsia="SimSun" w:cs="Times New Roman"/>
+          <w:b w:val="0"/>
+          <w:bCs w:val="0"/>
+          <w:sz w:val="25"/>
+          <w:szCs w:val="25"/>
+          <w:lang w:val="en-US"/>
+        </w:rPr>
+        <w:t xml:space="preserve">Currently, the Traffic-Based Route Guidance System website is an open-source platform, fostering </w:t>
+      </w:r>
+      <w:r>
+        <w:rPr>
+          <w:rFonts w:hint="default" w:ascii="Times New Roman" w:hAnsi="Times New Roman" w:eastAsia="SimSun" w:cs="Times New Roman"/>
+          <w:sz w:val="25"/>
+          <w:szCs w:val="25"/>
+        </w:rPr>
+        <w:t>transparency and community-driven innovation for urban planning in Boroondara.</w:t>
+      </w:r>
+      <w:r>
+        <w:rPr>
+          <w:rFonts w:hint="default" w:ascii="Times New Roman" w:hAnsi="Times New Roman" w:eastAsia="SimSun" w:cs="Times New Roman"/>
+          <w:sz w:val="25"/>
+          <w:szCs w:val="25"/>
+          <w:lang w:val="en-US"/>
+        </w:rPr>
+        <w:t xml:space="preserve"> However, I realize that this approach addresses various critical problems r</w:t>
+      </w:r>
+      <w:r>
+        <w:rPr>
+          <w:rFonts w:hint="default" w:ascii="Times New Roman" w:hAnsi="Times New Roman" w:eastAsia="SimSun" w:cs="Times New Roman"/>
+          <w:sz w:val="25"/>
+          <w:szCs w:val="25"/>
+        </w:rPr>
+        <w:t>egarding data privacy and security that must be addressed:</w:t>
+      </w:r>
+    </w:p>
+    <w:p>
+      <w:pPr>
+        <w:jc w:val="both"/>
+        <w:rPr>
+          <w:rFonts w:hint="default" w:ascii="Times New Roman" w:hAnsi="Times New Roman" w:eastAsia="SimSun" w:cs="Times New Roman"/>
+          <w:sz w:val="25"/>
+          <w:szCs w:val="25"/>
+        </w:rPr>
+      </w:pPr>
+    </w:p>
+    <w:p>
+      <w:pPr>
+        <w:pStyle w:val="18"/>
+        <w:keepNext w:val="0"/>
+        <w:keepLines w:val="0"/>
+        <w:widowControl/>
+        <w:numPr>
+          <w:ilvl w:val="0"/>
+          <w:numId w:val="2"/>
+        </w:numPr>
+        <w:suppressLineNumbers w:val="0"/>
+        <w:tabs>
+          <w:tab w:val="clear" w:pos="420"/>
+        </w:tabs>
+        <w:spacing w:before="0" w:beforeAutospacing="0" w:line="14" w:lineRule="atLeast"/>
+        <w:ind w:left="880" w:leftChars="0" w:hanging="420" w:firstLineChars="0"/>
+        <w:jc w:val="both"/>
+        <w:rPr>
+          <w:rFonts w:hint="default" w:ascii="Times New Roman" w:hAnsi="Times New Roman" w:cs="Times New Roman"/>
+          <w:b w:val="0"/>
+          <w:bCs w:val="0"/>
+          <w:sz w:val="25"/>
+          <w:szCs w:val="25"/>
+        </w:rPr>
+      </w:pPr>
+      <w:r>
+        <w:rPr>
+          <w:rFonts w:hint="default" w:ascii="Times New Roman" w:hAnsi="Times New Roman" w:eastAsia="SimSun" w:cs="Times New Roman"/>
+          <w:b w:val="0"/>
+          <w:bCs w:val="0"/>
+          <w:sz w:val="25"/>
+          <w:szCs w:val="25"/>
+        </w:rPr>
+        <w:t>Data Scraping and Reverse Engineering: Since the source code and API endpoints are public, malicious actors and hackers could potentially 'scrape' real-time traffic data at scale. Notably, there is a risk that high-frequency data could be reverse-engineered to track specific patterns of movement in the Boroondara area without a proprietary security layer.</w:t>
+      </w:r>
+    </w:p>
+    <w:p>
+      <w:pPr>
+        <w:pStyle w:val="18"/>
+        <w:keepNext w:val="0"/>
+        <w:keepLines w:val="0"/>
+        <w:widowControl/>
+        <w:numPr>
+          <w:ilvl w:val="0"/>
+          <w:numId w:val="2"/>
+        </w:numPr>
+        <w:suppressLineNumbers w:val="0"/>
+        <w:tabs>
+          <w:tab w:val="clear" w:pos="420"/>
+        </w:tabs>
+        <w:spacing w:before="0" w:beforeAutospacing="0" w:line="14" w:lineRule="atLeast"/>
+        <w:ind w:left="880" w:leftChars="0" w:hanging="420" w:firstLineChars="0"/>
+        <w:jc w:val="both"/>
+        <w:rPr>
+          <w:rFonts w:hint="default" w:ascii="Times New Roman" w:hAnsi="Times New Roman" w:cs="Times New Roman"/>
+          <w:b w:val="0"/>
+          <w:bCs w:val="0"/>
+          <w:sz w:val="25"/>
+          <w:szCs w:val="25"/>
+        </w:rPr>
+      </w:pPr>
+      <w:r>
+        <w:rPr>
+          <w:rFonts w:hint="default" w:ascii="Times New Roman" w:hAnsi="Times New Roman" w:eastAsia="SimSun" w:cs="Times New Roman"/>
+          <w:b w:val="0"/>
+          <w:bCs w:val="0"/>
+          <w:sz w:val="25"/>
+          <w:szCs w:val="25"/>
+        </w:rPr>
+        <w:t xml:space="preserve">Lack of Access Control (Authentication): As a prototype open-source tool, the system currently lacks a robust Multi-Factor Authentication (MFA) or Role-Based Access Control (RBAC). </w:t>
+      </w:r>
+      <w:r>
+        <w:rPr>
+          <w:rFonts w:hint="default" w:ascii="Times New Roman" w:hAnsi="Times New Roman" w:eastAsia="SimSun" w:cs="Times New Roman"/>
+          <w:b w:val="0"/>
+          <w:bCs w:val="0"/>
+          <w:sz w:val="25"/>
+          <w:szCs w:val="25"/>
+          <w:lang w:val="en-US"/>
+        </w:rPr>
+        <w:t>Consequently, t</w:t>
+      </w:r>
+      <w:r>
+        <w:rPr>
+          <w:rFonts w:hint="default" w:ascii="Times New Roman" w:hAnsi="Times New Roman" w:eastAsia="SimSun" w:cs="Times New Roman"/>
+          <w:b w:val="0"/>
+          <w:bCs w:val="0"/>
+          <w:sz w:val="25"/>
+          <w:szCs w:val="25"/>
+        </w:rPr>
+        <w:t>his means the distinction between a casual user and an administrative urban planner is thin, potentially allowing unauthorized users to access back-end traffic configurations or sensitive log files.</w:t>
+      </w:r>
+    </w:p>
+    <w:p>
+      <w:pPr>
+        <w:pStyle w:val="18"/>
+        <w:keepNext w:val="0"/>
+        <w:keepLines w:val="0"/>
+        <w:widowControl/>
+        <w:numPr>
+          <w:ilvl w:val="0"/>
+          <w:numId w:val="2"/>
+        </w:numPr>
+        <w:suppressLineNumbers w:val="0"/>
+        <w:tabs>
+          <w:tab w:val="clear" w:pos="420"/>
+        </w:tabs>
+        <w:spacing w:before="0" w:beforeAutospacing="0" w:line="14" w:lineRule="atLeast"/>
+        <w:ind w:left="880" w:leftChars="0" w:hanging="420" w:firstLineChars="0"/>
+        <w:jc w:val="both"/>
+        <w:rPr>
+          <w:rFonts w:hint="default" w:ascii="Times New Roman" w:hAnsi="Times New Roman" w:eastAsia="SimSun" w:cs="Times New Roman"/>
+          <w:b w:val="0"/>
+          <w:bCs w:val="0"/>
+          <w:sz w:val="25"/>
+          <w:szCs w:val="25"/>
+          <w:lang w:val="en-US"/>
+        </w:rPr>
+      </w:pPr>
+      <w:r>
+        <w:rPr>
+          <w:rFonts w:hint="default" w:ascii="Times New Roman" w:hAnsi="Times New Roman" w:eastAsia="SimSun" w:cs="Times New Roman"/>
+          <w:b w:val="0"/>
+          <w:bCs w:val="0"/>
+          <w:sz w:val="25"/>
+          <w:szCs w:val="25"/>
+        </w:rPr>
+        <w:t>Vulnerability to Data Injection: The open nature of the input fields and routing parameters could be exploited for "Data Injection" attacks. If not properly sanitized, an attacker could input malicious scripts or false traffic reports into the system, leading to incorrect route guidance and compromising the integrity of the entire traffic network.</w:t>
+      </w:r>
+    </w:p>
+    <w:p>
+      <w:pPr>
+        <w:pStyle w:val="3"/>
+        <w:numPr>
+          <w:ilvl w:val="0"/>
+          <w:numId w:val="0"/>
+        </w:numPr>
+        <w:bidi w:val="0"/>
+        <w:ind w:leftChars="0"/>
+        <w:rPr>
+          <w:rFonts w:hint="default" w:ascii="Times New Roman" w:hAnsi="Times New Roman" w:cs="Times New Roman"/>
+          <w:lang w:val="en-US"/>
+        </w:rPr>
+      </w:pPr>
+      <w:r>
+        <w:rPr>
+          <w:rFonts w:hint="default" w:ascii="Times New Roman" w:hAnsi="Times New Roman" w:cs="Times New Roman"/>
+          <w:lang w:val="en-US"/>
+        </w:rPr>
+        <w:t>3.2 Algorithms Bias and Fairness</w:t>
+      </w:r>
+    </w:p>
+    <w:p>
+      <w:pPr>
+        <w:jc w:val="both"/>
+      </w:pPr>
+      <w:r>
+        <w:rPr>
+          <w:rFonts w:hint="default" w:ascii="Times New Roman" w:hAnsi="Times New Roman" w:eastAsia="SimSun" w:cs="Times New Roman"/>
+          <w:b w:val="0"/>
+          <w:bCs w:val="0"/>
+          <w:sz w:val="25"/>
+          <w:szCs w:val="25"/>
+        </w:rPr>
+        <w:t>In the TBRGS website, algorithms are responsible for predicting the shortest path from a starting point to a desired location with suitable speed and updated current traffic flow. While th</w:t>
+      </w:r>
+      <w:r>
+        <w:rPr>
+          <w:rFonts w:hint="default" w:ascii="Times New Roman" w:hAnsi="Times New Roman" w:eastAsia="SimSun" w:cs="Times New Roman"/>
+          <w:b w:val="0"/>
+          <w:bCs w:val="0"/>
+          <w:sz w:val="25"/>
+          <w:szCs w:val="25"/>
+          <w:lang w:val="en-US"/>
+        </w:rPr>
+        <w:t>ese</w:t>
+      </w:r>
+      <w:r>
+        <w:rPr>
+          <w:rFonts w:hint="default" w:ascii="Times New Roman" w:hAnsi="Times New Roman" w:eastAsia="SimSun" w:cs="Times New Roman"/>
+          <w:b w:val="0"/>
+          <w:bCs w:val="0"/>
+          <w:sz w:val="25"/>
+          <w:szCs w:val="25"/>
+        </w:rPr>
+        <w:t xml:space="preserve"> </w:t>
+      </w:r>
+      <w:r>
+        <w:rPr>
+          <w:rFonts w:hint="default" w:ascii="Times New Roman" w:hAnsi="Times New Roman" w:eastAsia="SimSun" w:cs="Times New Roman"/>
+          <w:b w:val="0"/>
+          <w:bCs w:val="0"/>
+          <w:sz w:val="25"/>
+          <w:szCs w:val="25"/>
+          <w:lang w:val="en-US"/>
+        </w:rPr>
+        <w:t>advanced machine learning models</w:t>
+      </w:r>
+      <w:r>
+        <w:rPr>
+          <w:rFonts w:hint="default" w:ascii="Times New Roman" w:hAnsi="Times New Roman" w:eastAsia="SimSun" w:cs="Times New Roman"/>
+          <w:b w:val="0"/>
+          <w:bCs w:val="0"/>
+          <w:sz w:val="25"/>
+          <w:szCs w:val="25"/>
+        </w:rPr>
+        <w:t xml:space="preserve"> is designed to optimize individual travel efficiency, it raises important ethical questions regarding how these automated decisions affect different communities within Boroondara.</w:t>
+      </w:r>
+    </w:p>
+    <w:p>
+      <w:pPr>
+        <w:pStyle w:val="18"/>
+        <w:keepNext w:val="0"/>
+        <w:keepLines w:val="0"/>
+        <w:widowControl/>
+        <w:numPr>
+          <w:ilvl w:val="0"/>
+          <w:numId w:val="2"/>
+        </w:numPr>
+        <w:suppressLineNumbers w:val="0"/>
+        <w:tabs>
+          <w:tab w:val="clear" w:pos="420"/>
+        </w:tabs>
+        <w:spacing w:before="0" w:beforeAutospacing="0" w:line="14" w:lineRule="atLeast"/>
+        <w:ind w:left="880" w:leftChars="0" w:hanging="420" w:firstLineChars="0"/>
+        <w:jc w:val="both"/>
+        <w:rPr>
+          <w:b w:val="0"/>
+          <w:bCs w:val="0"/>
+          <w:sz w:val="25"/>
+          <w:szCs w:val="25"/>
+        </w:rPr>
+      </w:pPr>
+      <w:r>
+        <w:rPr>
+          <w:b w:val="0"/>
+          <w:bCs w:val="0"/>
+          <w:sz w:val="25"/>
+          <w:szCs w:val="25"/>
+        </w:rPr>
+        <w:t>Geographical Fairness:</w:t>
+      </w:r>
+      <w:r>
+        <w:rPr>
           <w:rFonts w:hint="default"/>
-          <w:lang w:val="en-US"/>
-        </w:rPr>
-      </w:pPr>
+          <w:b w:val="0"/>
+          <w:bCs w:val="0"/>
+          <w:sz w:val="25"/>
+          <w:szCs w:val="25"/>
+          <w:lang w:val="en-US"/>
+        </w:rPr>
+        <w:t xml:space="preserve"> Next,, I </w:t>
+      </w:r>
+      <w:r>
+        <w:rPr>
+          <w:b w:val="0"/>
+          <w:bCs w:val="0"/>
+          <w:sz w:val="25"/>
+          <w:szCs w:val="25"/>
+        </w:rPr>
+        <w:t xml:space="preserve">recognize that an optimization algorithm, if left unchecked, might prioritize "faster" routes through affluent neighborhoods while inadvertently increasing noise and air pollution in lower-income residential areas. </w:t>
+      </w:r>
       <w:r>
         <w:rPr>
           <w:rFonts w:hint="default"/>
-          <w:lang w:val="en-US"/>
-        </w:rPr>
-        <w:t>3.1 Data Privacy and Security</w:t>
-      </w:r>
-    </w:p>
-    <w:p>
-      <w:pPr>
+          <w:b w:val="0"/>
+          <w:bCs w:val="0"/>
+          <w:sz w:val="25"/>
+          <w:szCs w:val="25"/>
+          <w:lang w:val="en-US"/>
+        </w:rPr>
+        <w:t>In addition, the</w:t>
+      </w:r>
+      <w:r>
+        <w:rPr>
+          <w:b w:val="0"/>
+          <w:bCs w:val="0"/>
+          <w:sz w:val="25"/>
+          <w:szCs w:val="25"/>
+        </w:rPr>
+        <w:t xml:space="preserve"> system mitigates this by treating all urban sectors with equal weight, relying strictly on SCATS flow metadata rather than socio-economic variables.</w:t>
+      </w:r>
+    </w:p>
+    <w:p>
+      <w:pPr>
+        <w:pStyle w:val="18"/>
+        <w:keepNext w:val="0"/>
+        <w:keepLines w:val="0"/>
+        <w:widowControl/>
+        <w:numPr>
+          <w:ilvl w:val="0"/>
+          <w:numId w:val="2"/>
+        </w:numPr>
+        <w:suppressLineNumbers w:val="0"/>
+        <w:tabs>
+          <w:tab w:val="clear" w:pos="420"/>
+        </w:tabs>
+        <w:spacing w:before="0" w:beforeAutospacing="0" w:line="14" w:lineRule="atLeast"/>
+        <w:ind w:left="880" w:leftChars="0" w:hanging="420" w:firstLineChars="0"/>
+        <w:jc w:val="both"/>
+      </w:pPr>
+      <w:r>
+        <w:rPr>
+          <w:b w:val="0"/>
+          <w:bCs w:val="0"/>
+          <w:sz w:val="25"/>
+          <w:szCs w:val="25"/>
+        </w:rPr>
+        <w:t xml:space="preserve">The "Short-cutting" Dilemma: In </w:t>
+      </w:r>
+      <w:r>
         <w:rPr>
           <w:rFonts w:hint="default"/>
-          <w:lang w:val="en-US"/>
-        </w:rPr>
-      </w:pPr>
-    </w:p>
-    <w:p>
-      <w:pPr>
+          <w:b w:val="0"/>
+          <w:bCs w:val="0"/>
+          <w:sz w:val="25"/>
+          <w:szCs w:val="25"/>
+          <w:lang w:val="en-US"/>
+        </w:rPr>
+        <w:t>the</w:t>
+      </w:r>
+      <w:r>
+        <w:rPr>
+          <w:b w:val="0"/>
+          <w:bCs w:val="0"/>
+          <w:sz w:val="25"/>
+          <w:szCs w:val="25"/>
+        </w:rPr>
+        <w:t xml:space="preserve"> pursuit of providing a "suitable speed" and the "shortest path," there is a risk that the algorithm could redirect heavy traffic from main arterial roads into quiet, local streets. </w:t>
+      </w:r>
+      <w:r>
         <w:rPr>
           <w:rFonts w:hint="default"/>
+          <w:b w:val="0"/>
+          <w:bCs w:val="0"/>
+          <w:sz w:val="25"/>
+          <w:szCs w:val="25"/>
+          <w:lang w:val="en-US"/>
+        </w:rPr>
+        <w:t>For</w:t>
+      </w:r>
+      <w:r>
+        <w:rPr>
+          <w:b w:val="0"/>
+          <w:bCs w:val="0"/>
+          <w:sz w:val="25"/>
+          <w:szCs w:val="25"/>
+        </w:rPr>
+        <w:t xml:space="preserve"> ensur</w:t>
+      </w:r>
+      <w:r>
+        <w:rPr>
+          <w:rFonts w:hint="default"/>
+          <w:b w:val="0"/>
+          <w:bCs w:val="0"/>
+          <w:sz w:val="25"/>
+          <w:szCs w:val="25"/>
+          <w:lang w:val="en-US"/>
+        </w:rPr>
+        <w:t>ing</w:t>
+      </w:r>
+      <w:r>
+        <w:rPr>
+          <w:b w:val="0"/>
+          <w:bCs w:val="0"/>
+          <w:sz w:val="25"/>
+          <w:szCs w:val="25"/>
+        </w:rPr>
+        <w:t xml:space="preserve"> fairness, our routing logic incorporates constraints that discourage excessive through-traffic in residential zones, protecting the quality of life for all citizens equitably.</w:t>
+      </w:r>
+    </w:p>
+    <w:p>
+      <w:pPr>
+        <w:pStyle w:val="18"/>
+        <w:keepNext w:val="0"/>
+        <w:keepLines w:val="0"/>
+        <w:widowControl/>
+        <w:numPr>
+          <w:ilvl w:val="0"/>
+          <w:numId w:val="2"/>
+        </w:numPr>
+        <w:suppressLineNumbers w:val="0"/>
+        <w:tabs>
+          <w:tab w:val="clear" w:pos="420"/>
+        </w:tabs>
+        <w:spacing w:before="0" w:beforeAutospacing="0" w:line="14" w:lineRule="atLeast"/>
+        <w:ind w:left="880" w:leftChars="0" w:hanging="420" w:firstLineChars="0"/>
+        <w:jc w:val="both"/>
+        <w:rPr>
+          <w:rFonts w:hint="default" w:ascii="Times New Roman" w:hAnsi="Times New Roman" w:cs="Times New Roman"/>
+          <w:b w:val="0"/>
+          <w:bCs w:val="0"/>
+          <w:sz w:val="25"/>
+          <w:szCs w:val="25"/>
+        </w:rPr>
+      </w:pPr>
+      <w:r>
+        <w:rPr>
+          <w:b w:val="0"/>
+          <w:bCs w:val="0"/>
+        </w:rPr>
+        <w:t xml:space="preserve">Transparency in Optimization: By utilizing an open-source framework, </w:t>
+      </w:r>
+      <w:r>
+        <w:rPr>
+          <w:rFonts w:hint="default"/>
+          <w:b w:val="0"/>
+          <w:bCs w:val="0"/>
+          <w:lang w:val="en-US"/>
+        </w:rPr>
+        <w:t>I</w:t>
+      </w:r>
+      <w:r>
+        <w:rPr>
+          <w:b w:val="0"/>
+          <w:bCs w:val="0"/>
+        </w:rPr>
+        <w:t xml:space="preserve"> ensure that the logic behind our "updated current traffic flow" predictions is transparent. </w:t>
+      </w:r>
+      <w:r>
+        <w:rPr>
+          <w:rFonts w:hint="default"/>
+          <w:b w:val="0"/>
+          <w:bCs w:val="0"/>
+          <w:lang w:val="en-US"/>
+        </w:rPr>
+        <w:t>Particularly, t</w:t>
+      </w:r>
+      <w:r>
+        <w:rPr>
+          <w:b w:val="0"/>
+          <w:bCs w:val="0"/>
+        </w:rPr>
+        <w:t>his</w:t>
+      </w:r>
+      <w:r>
+        <w:rPr>
+          <w:rFonts w:hint="default"/>
+          <w:b w:val="0"/>
+          <w:bCs w:val="0"/>
+          <w:lang w:val="en-US"/>
+        </w:rPr>
+        <w:t xml:space="preserve"> solution</w:t>
+      </w:r>
+      <w:r>
+        <w:rPr>
+          <w:b w:val="0"/>
+          <w:bCs w:val="0"/>
+        </w:rPr>
+        <w:t xml:space="preserve"> prevents "Black Box" bias</w:t>
+      </w:r>
+      <w:r>
+        <w:rPr>
+          <w:rFonts w:hint="default"/>
+          <w:b w:val="0"/>
+          <w:bCs w:val="0"/>
+          <w:lang w:val="en-US"/>
+        </w:rPr>
+        <w:t xml:space="preserve"> </w:t>
+      </w:r>
+      <w:r>
+        <w:rPr>
+          <w:b w:val="0"/>
+          <w:bCs w:val="0"/>
+        </w:rPr>
+        <w:t>where users might feel that certain routes are being prioritized for hidden reasons, thus maintaining public trust in the system's integrity.</w:t>
+      </w:r>
+    </w:p>
+    <w:p>
+      <w:pPr>
+        <w:pStyle w:val="3"/>
+        <w:numPr>
+          <w:ilvl w:val="0"/>
+          <w:numId w:val="0"/>
+        </w:numPr>
+        <w:bidi w:val="0"/>
+        <w:ind w:leftChars="0"/>
+        <w:rPr>
+          <w:rFonts w:hint="default" w:ascii="Times New Roman" w:hAnsi="Times New Roman" w:cs="Times New Roman"/>
+          <w:lang w:val="en-US"/>
+        </w:rPr>
+      </w:pPr>
+      <w:r>
+        <w:rPr>
+          <w:rFonts w:hint="default" w:ascii="Times New Roman" w:hAnsi="Times New Roman" w:cs="Times New Roman"/>
+          <w:lang w:val="en-US"/>
+        </w:rPr>
+        <w:t>3.3 Accountability and Transparency</w:t>
+      </w:r>
+    </w:p>
+    <w:p>
+      <w:pPr>
+        <w:jc w:val="both"/>
+        <w:rPr>
+          <w:rFonts w:hint="default" w:ascii="Times New Roman" w:hAnsi="Times New Roman" w:cs="Times New Roman"/>
+          <w:sz w:val="25"/>
+          <w:szCs w:val="25"/>
+          <w:lang w:val="en-US"/>
+        </w:rPr>
+      </w:pPr>
+      <w:r>
+        <w:rPr>
+          <w:rFonts w:hint="default" w:ascii="Times New Roman" w:hAnsi="Times New Roman" w:cs="Times New Roman"/>
+          <w:sz w:val="25"/>
+          <w:szCs w:val="25"/>
+          <w:lang w:val="en-US"/>
+        </w:rPr>
+        <w:t>Next, accountability in AI ensures a clean  l</w:t>
+      </w:r>
+      <w:r>
+        <w:rPr>
+          <w:rFonts w:hint="default" w:ascii="Times New Roman" w:hAnsi="Times New Roman" w:eastAsia="SimSun" w:cs="Times New Roman"/>
+          <w:sz w:val="25"/>
+          <w:szCs w:val="25"/>
+        </w:rPr>
+        <w:t>ine of responsibility for the system's decisions</w:t>
+      </w:r>
+      <w:r>
+        <w:rPr>
+          <w:rFonts w:hint="default" w:ascii="Times New Roman" w:hAnsi="Times New Roman" w:eastAsia="SimSun" w:cs="Times New Roman"/>
+          <w:sz w:val="25"/>
+          <w:szCs w:val="25"/>
+          <w:lang w:val="en-US"/>
+        </w:rPr>
+        <w:t xml:space="preserve"> </w:t>
+      </w:r>
+      <w:r>
+        <w:rPr>
+          <w:rFonts w:hint="default" w:ascii="Times New Roman" w:hAnsi="Times New Roman" w:eastAsia="SimSun" w:cs="Times New Roman"/>
+          <w:sz w:val="25"/>
+          <w:szCs w:val="25"/>
+        </w:rPr>
+        <w:t>while transparency demands that the logic behind those decisions is accessible and understandable</w:t>
+      </w:r>
+      <w:r>
+        <w:rPr>
+          <w:rFonts w:hint="default" w:ascii="Times New Roman" w:hAnsi="Times New Roman" w:eastAsia="SimSun" w:cs="Times New Roman"/>
+          <w:sz w:val="25"/>
+          <w:szCs w:val="25"/>
+          <w:lang w:val="en-US"/>
+        </w:rPr>
+        <w:t>. Besides</w:t>
+      </w:r>
+      <w:bookmarkStart w:id="9" w:name="_GoBack"/>
+      <w:bookmarkEnd w:id="9"/>
+    </w:p>
+    <w:p>
+      <w:pPr>
+        <w:rPr>
+          <w:rFonts w:hint="default" w:ascii="Times New Roman" w:hAnsi="Times New Roman" w:cs="Times New Roman"/>
+          <w:lang w:val="en-US"/>
+        </w:rPr>
+      </w:pPr>
+    </w:p>
+    <w:p>
+      <w:pPr>
+        <w:rPr>
+          <w:rFonts w:hint="default" w:ascii="Times New Roman" w:hAnsi="Times New Roman" w:cs="Times New Roman"/>
+          <w:lang w:val="en-US"/>
+        </w:rPr>
+      </w:pPr>
+    </w:p>
+    <w:p>
+      <w:pPr>
+        <w:rPr>
+          <w:rFonts w:hint="default" w:ascii="Times New Roman" w:hAnsi="Times New Roman" w:cs="Times New Roman"/>
+          <w:lang w:val="en-US"/>
+        </w:rPr>
+      </w:pPr>
+    </w:p>
+    <w:p>
+      <w:pPr>
+        <w:rPr>
+          <w:rFonts w:hint="default" w:ascii="Times New Roman" w:hAnsi="Times New Roman" w:cs="Times New Roman"/>
           <w:lang w:val="en-US"/>
         </w:rPr>
       </w:pPr>
@@ -4318,7 +5172,7 @@
       <w:fldChar w:fldCharType="separate"/>
     </w:r>
     <w:r>
-      <w:t>8/04/2026</w:t>
+      <w:t>9/04/2026</w:t>
     </w:r>
     <w:r>
       <w:fldChar w:fldCharType="end"/>

</xml_diff>